<commit_message>
Integrate figures/tables for CCTC: combine Mg+statins forest plot, split S1 trace, period abbreviations in refs
Co-Authored-By: Tatsuki Onishi <bougtoir@gmail.com>
</commit_message>
<xml_diff>
--- a/rct-decomposition/KOTHA_Framework_CCTC_tables.docx
+++ b/rct-decomposition/KOTHA_Framework_CCTC_tables.docx
@@ -1439,14 +1439,12 @@
         <w:tblLayout w:type="fixed"/>
       </w:tblPr>
       <w:tblGrid>
-        <w:gridCol w:w="990"/>
-        <w:gridCol w:w="990"/>
-        <w:gridCol w:w="990"/>
-        <w:gridCol w:w="990"/>
-        <w:gridCol w:w="990"/>
-        <w:gridCol w:w="990"/>
-        <w:gridCol w:w="990"/>
-        <w:gridCol w:w="990"/>
+        <w:gridCol w:w="1320"/>
+        <w:gridCol w:w="1320"/>
+        <w:gridCol w:w="1320"/>
+        <w:gridCol w:w="1320"/>
+        <w:gridCol w:w="1320"/>
+        <w:gridCol w:w="1320"/>
       </w:tblGrid>
       <w:tr>
         <w:trPr>
@@ -1467,2674 +1465,10 @@
                 <w:szCs w:val="20"/>
                 <w:b/>
               </w:rPr>
-              <w:t xml:space="preserve">Study</w:t>
+              <w:t xml:space="preserve">Case</w:t>
             </w:r>
           </w:p>
         </w:tc>
-        <w:tc>
-          <w:tcPr/>
-          <w:p>
-            <w:pPr>
-              <w:pStyle w:val="Normal"/>
-              <w:jc w:val="left"/>
-              <w:spacing w:line="240" w:lineRule="auto" w:after="0"/>
-            </w:pPr>
-            <w:r>
-              <w:rPr>
-                <w:rFonts w:ascii="Times New Roman" w:hAnsi="Times New Roman" w:cs="Times New Roman" w:eastAsia="Times New Roman"/>
-                <w:sz w:val="20"/>
-                <w:szCs w:val="20"/>
-                <w:b/>
-              </w:rPr>
-              <w:t xml:space="preserve">Year</w:t>
-            </w:r>
-          </w:p>
-        </w:tc>
-        <w:tc>
-          <w:tcPr/>
-          <w:p>
-            <w:pPr>
-              <w:pStyle w:val="Normal"/>
-              <w:jc w:val="left"/>
-              <w:spacing w:line="240" w:lineRule="auto" w:after="0"/>
-            </w:pPr>
-            <w:r>
-              <w:rPr>
-                <w:rFonts w:ascii="Times New Roman" w:hAnsi="Times New Roman" w:cs="Times New Roman" w:eastAsia="Times New Roman"/>
-                <w:sz w:val="20"/>
-                <w:szCs w:val="20"/>
-                <w:b/>
-              </w:rPr>
-              <w:t xml:space="preserve">Era</w:t>
-            </w:r>
-          </w:p>
-        </w:tc>
-        <w:tc>
-          <w:tcPr/>
-          <w:p>
-            <w:pPr>
-              <w:pStyle w:val="Normal"/>
-              <w:jc w:val="left"/>
-              <w:spacing w:line="240" w:lineRule="auto" w:after="0"/>
-            </w:pPr>
-            <w:r>
-              <w:rPr>
-                <w:rFonts w:ascii="Times New Roman" w:hAnsi="Times New Roman" w:cs="Times New Roman" w:eastAsia="Times New Roman"/>
-                <w:sz w:val="20"/>
-                <w:szCs w:val="20"/>
-                <w:b/>
-              </w:rPr>
-              <w:t xml:space="preserve">Events (Mg)</w:t>
-            </w:r>
-          </w:p>
-        </w:tc>
-        <w:tc>
-          <w:tcPr/>
-          <w:p>
-            <w:pPr>
-              <w:pStyle w:val="Normal"/>
-              <w:jc w:val="left"/>
-              <w:spacing w:line="240" w:lineRule="auto" w:after="0"/>
-            </w:pPr>
-            <w:r>
-              <w:rPr>
-                <w:rFonts w:ascii="Times New Roman" w:hAnsi="Times New Roman" w:cs="Times New Roman" w:eastAsia="Times New Roman"/>
-                <w:sz w:val="20"/>
-                <w:szCs w:val="20"/>
-                <w:b/>
-              </w:rPr>
-              <w:t xml:space="preserve">N (Mg)</w:t>
-            </w:r>
-          </w:p>
-        </w:tc>
-        <w:tc>
-          <w:tcPr/>
-          <w:p>
-            <w:pPr>
-              <w:pStyle w:val="Normal"/>
-              <w:jc w:val="left"/>
-              <w:spacing w:line="240" w:lineRule="auto" w:after="0"/>
-            </w:pPr>
-            <w:r>
-              <w:rPr>
-                <w:rFonts w:ascii="Times New Roman" w:hAnsi="Times New Roman" w:cs="Times New Roman" w:eastAsia="Times New Roman"/>
-                <w:sz w:val="20"/>
-                <w:szCs w:val="20"/>
-                <w:b/>
-              </w:rPr>
-              <w:t xml:space="preserve">Events (Ctrl)</w:t>
-            </w:r>
-          </w:p>
-        </w:tc>
-        <w:tc>
-          <w:tcPr/>
-          <w:p>
-            <w:pPr>
-              <w:pStyle w:val="Normal"/>
-              <w:jc w:val="left"/>
-              <w:spacing w:line="240" w:lineRule="auto" w:after="0"/>
-            </w:pPr>
-            <w:r>
-              <w:rPr>
-                <w:rFonts w:ascii="Times New Roman" w:hAnsi="Times New Roman" w:cs="Times New Roman" w:eastAsia="Times New Roman"/>
-                <w:sz w:val="20"/>
-                <w:szCs w:val="20"/>
-                <w:b/>
-              </w:rPr>
-              <w:t xml:space="preserve">N (Ctrl)</w:t>
-            </w:r>
-          </w:p>
-        </w:tc>
-        <w:tc>
-          <w:tcPr/>
-          <w:p>
-            <w:pPr>
-              <w:pStyle w:val="Normal"/>
-              <w:jc w:val="left"/>
-              <w:spacing w:line="240" w:lineRule="auto" w:after="0"/>
-            </w:pPr>
-            <w:r>
-              <w:rPr>
-                <w:rFonts w:ascii="Times New Roman" w:hAnsi="Times New Roman" w:cs="Times New Roman" w:eastAsia="Times New Roman"/>
-                <w:sz w:val="20"/>
-                <w:szCs w:val="20"/>
-                <w:b/>
-              </w:rPr>
-              <w:t xml:space="preserve">Control rate</w:t>
-            </w:r>
-          </w:p>
-        </w:tc>
-      </w:tr>
-      <w:tr>
-        <w:tc>
-          <w:tcPr/>
-          <w:p>
-            <w:pPr>
-              <w:pStyle w:val="Normal"/>
-              <w:jc w:val="left"/>
-              <w:spacing w:line="240" w:lineRule="auto" w:after="0"/>
-            </w:pPr>
-            <w:r>
-              <w:rPr>
-                <w:rFonts w:ascii="Times New Roman" w:hAnsi="Times New Roman" w:cs="Times New Roman" w:eastAsia="Times New Roman"/>
-                <w:sz w:val="20"/>
-                <w:szCs w:val="20"/>
-              </w:rPr>
-              <w:t xml:space="preserve">Morton 1984</w:t>
-            </w:r>
-          </w:p>
-        </w:tc>
-        <w:tc>
-          <w:tcPr/>
-          <w:p>
-            <w:pPr>
-              <w:pStyle w:val="Normal"/>
-              <w:jc w:val="left"/>
-              <w:spacing w:line="240" w:lineRule="auto" w:after="0"/>
-            </w:pPr>
-            <w:r>
-              <w:rPr>
-                <w:rFonts w:ascii="Times New Roman" w:hAnsi="Times New Roman" w:cs="Times New Roman" w:eastAsia="Times New Roman"/>
-                <w:sz w:val="20"/>
-                <w:szCs w:val="20"/>
-              </w:rPr>
-              <w:t xml:space="preserve">1984</w:t>
-            </w:r>
-          </w:p>
-        </w:tc>
-        <w:tc>
-          <w:tcPr/>
-          <w:p>
-            <w:pPr>
-              <w:pStyle w:val="Normal"/>
-              <w:jc w:val="left"/>
-              <w:spacing w:line="240" w:lineRule="auto" w:after="0"/>
-            </w:pPr>
-            <w:r>
-              <w:rPr>
-                <w:rFonts w:ascii="Times New Roman" w:hAnsi="Times New Roman" w:cs="Times New Roman" w:eastAsia="Times New Roman"/>
-                <w:sz w:val="20"/>
-                <w:szCs w:val="20"/>
-              </w:rPr>
-              <w:t xml:space="preserve">Pre-thrombolysis</w:t>
-            </w:r>
-          </w:p>
-        </w:tc>
-        <w:tc>
-          <w:tcPr/>
-          <w:p>
-            <w:pPr>
-              <w:pStyle w:val="Normal"/>
-              <w:jc w:val="left"/>
-              <w:spacing w:line="240" w:lineRule="auto" w:after="0"/>
-            </w:pPr>
-            <w:r>
-              <w:rPr>
-                <w:rFonts w:ascii="Times New Roman" w:hAnsi="Times New Roman" w:cs="Times New Roman" w:eastAsia="Times New Roman"/>
-                <w:sz w:val="20"/>
-                <w:szCs w:val="20"/>
-              </w:rPr>
-              <w:t xml:space="preserve">1</w:t>
-            </w:r>
-          </w:p>
-        </w:tc>
-        <w:tc>
-          <w:tcPr/>
-          <w:p>
-            <w:pPr>
-              <w:pStyle w:val="Normal"/>
-              <w:jc w:val="left"/>
-              <w:spacing w:line="240" w:lineRule="auto" w:after="0"/>
-            </w:pPr>
-            <w:r>
-              <w:rPr>
-                <w:rFonts w:ascii="Times New Roman" w:hAnsi="Times New Roman" w:cs="Times New Roman" w:eastAsia="Times New Roman"/>
-                <w:sz w:val="20"/>
-                <w:szCs w:val="20"/>
-              </w:rPr>
-              <w:t xml:space="preserve">40</w:t>
-            </w:r>
-          </w:p>
-        </w:tc>
-        <w:tc>
-          <w:tcPr/>
-          <w:p>
-            <w:pPr>
-              <w:pStyle w:val="Normal"/>
-              <w:jc w:val="left"/>
-              <w:spacing w:line="240" w:lineRule="auto" w:after="0"/>
-            </w:pPr>
-            <w:r>
-              <w:rPr>
-                <w:rFonts w:ascii="Times New Roman" w:hAnsi="Times New Roman" w:cs="Times New Roman" w:eastAsia="Times New Roman"/>
-                <w:sz w:val="20"/>
-                <w:szCs w:val="20"/>
-              </w:rPr>
-              <w:t xml:space="preserve">2</w:t>
-            </w:r>
-          </w:p>
-        </w:tc>
-        <w:tc>
-          <w:tcPr/>
-          <w:p>
-            <w:pPr>
-              <w:pStyle w:val="Normal"/>
-              <w:jc w:val="left"/>
-              <w:spacing w:line="240" w:lineRule="auto" w:after="0"/>
-            </w:pPr>
-            <w:r>
-              <w:rPr>
-                <w:rFonts w:ascii="Times New Roman" w:hAnsi="Times New Roman" w:cs="Times New Roman" w:eastAsia="Times New Roman"/>
-                <w:sz w:val="20"/>
-                <w:szCs w:val="20"/>
-              </w:rPr>
-              <w:t xml:space="preserve">36</w:t>
-            </w:r>
-          </w:p>
-        </w:tc>
-        <w:tc>
-          <w:tcPr/>
-          <w:p>
-            <w:pPr>
-              <w:pStyle w:val="Normal"/>
-              <w:jc w:val="left"/>
-              <w:spacing w:line="240" w:lineRule="auto" w:after="0"/>
-            </w:pPr>
-            <w:r>
-              <w:rPr>
-                <w:rFonts w:ascii="Times New Roman" w:hAnsi="Times New Roman" w:cs="Times New Roman" w:eastAsia="Times New Roman"/>
-                <w:sz w:val="20"/>
-                <w:szCs w:val="20"/>
-              </w:rPr>
-              <w:t xml:space="preserve">5.6%</w:t>
-            </w:r>
-          </w:p>
-        </w:tc>
-      </w:tr>
-      <w:tr>
-        <w:tc>
-          <w:tcPr/>
-          <w:p>
-            <w:pPr>
-              <w:pStyle w:val="Normal"/>
-              <w:jc w:val="left"/>
-              <w:spacing w:line="240" w:lineRule="auto" w:after="0"/>
-            </w:pPr>
-            <w:r>
-              <w:rPr>
-                <w:rFonts w:ascii="Times New Roman" w:hAnsi="Times New Roman" w:cs="Times New Roman" w:eastAsia="Times New Roman"/>
-                <w:sz w:val="20"/>
-                <w:szCs w:val="20"/>
-              </w:rPr>
-              <w:t xml:space="preserve">Rasmussen 1986</w:t>
-            </w:r>
-          </w:p>
-        </w:tc>
-        <w:tc>
-          <w:tcPr/>
-          <w:p>
-            <w:pPr>
-              <w:pStyle w:val="Normal"/>
-              <w:jc w:val="left"/>
-              <w:spacing w:line="240" w:lineRule="auto" w:after="0"/>
-            </w:pPr>
-            <w:r>
-              <w:rPr>
-                <w:rFonts w:ascii="Times New Roman" w:hAnsi="Times New Roman" w:cs="Times New Roman" w:eastAsia="Times New Roman"/>
-                <w:sz w:val="20"/>
-                <w:szCs w:val="20"/>
-              </w:rPr>
-              <w:t xml:space="preserve">1986</w:t>
-            </w:r>
-          </w:p>
-        </w:tc>
-        <w:tc>
-          <w:tcPr/>
-          <w:p>
-            <w:pPr>
-              <w:pStyle w:val="Normal"/>
-              <w:jc w:val="left"/>
-              <w:spacing w:line="240" w:lineRule="auto" w:after="0"/>
-            </w:pPr>
-            <w:r>
-              <w:rPr>
-                <w:rFonts w:ascii="Times New Roman" w:hAnsi="Times New Roman" w:cs="Times New Roman" w:eastAsia="Times New Roman"/>
-                <w:sz w:val="20"/>
-                <w:szCs w:val="20"/>
-              </w:rPr>
-              <w:t xml:space="preserve">Pre-thrombolysis</w:t>
-            </w:r>
-          </w:p>
-        </w:tc>
-        <w:tc>
-          <w:tcPr/>
-          <w:p>
-            <w:pPr>
-              <w:pStyle w:val="Normal"/>
-              <w:jc w:val="left"/>
-              <w:spacing w:line="240" w:lineRule="auto" w:after="0"/>
-            </w:pPr>
-            <w:r>
-              <w:rPr>
-                <w:rFonts w:ascii="Times New Roman" w:hAnsi="Times New Roman" w:cs="Times New Roman" w:eastAsia="Times New Roman"/>
-                <w:sz w:val="20"/>
-                <w:szCs w:val="20"/>
-              </w:rPr>
-              <w:t xml:space="preserve">1</w:t>
-            </w:r>
-          </w:p>
-        </w:tc>
-        <w:tc>
-          <w:tcPr/>
-          <w:p>
-            <w:pPr>
-              <w:pStyle w:val="Normal"/>
-              <w:jc w:val="left"/>
-              <w:spacing w:line="240" w:lineRule="auto" w:after="0"/>
-            </w:pPr>
-            <w:r>
-              <w:rPr>
-                <w:rFonts w:ascii="Times New Roman" w:hAnsi="Times New Roman" w:cs="Times New Roman" w:eastAsia="Times New Roman"/>
-                <w:sz w:val="20"/>
-                <w:szCs w:val="20"/>
-              </w:rPr>
-              <w:t xml:space="preserve">56</w:t>
-            </w:r>
-          </w:p>
-        </w:tc>
-        <w:tc>
-          <w:tcPr/>
-          <w:p>
-            <w:pPr>
-              <w:pStyle w:val="Normal"/>
-              <w:jc w:val="left"/>
-              <w:spacing w:line="240" w:lineRule="auto" w:after="0"/>
-            </w:pPr>
-            <w:r>
-              <w:rPr>
-                <w:rFonts w:ascii="Times New Roman" w:hAnsi="Times New Roman" w:cs="Times New Roman" w:eastAsia="Times New Roman"/>
-                <w:sz w:val="20"/>
-                <w:szCs w:val="20"/>
-              </w:rPr>
-              <w:t xml:space="preserve">9</w:t>
-            </w:r>
-          </w:p>
-        </w:tc>
-        <w:tc>
-          <w:tcPr/>
-          <w:p>
-            <w:pPr>
-              <w:pStyle w:val="Normal"/>
-              <w:jc w:val="left"/>
-              <w:spacing w:line="240" w:lineRule="auto" w:after="0"/>
-            </w:pPr>
-            <w:r>
-              <w:rPr>
-                <w:rFonts w:ascii="Times New Roman" w:hAnsi="Times New Roman" w:cs="Times New Roman" w:eastAsia="Times New Roman"/>
-                <w:sz w:val="20"/>
-                <w:szCs w:val="20"/>
-              </w:rPr>
-              <w:t xml:space="preserve">79</w:t>
-            </w:r>
-          </w:p>
-        </w:tc>
-        <w:tc>
-          <w:tcPr/>
-          <w:p>
-            <w:pPr>
-              <w:pStyle w:val="Normal"/>
-              <w:jc w:val="left"/>
-              <w:spacing w:line="240" w:lineRule="auto" w:after="0"/>
-            </w:pPr>
-            <w:r>
-              <w:rPr>
-                <w:rFonts w:ascii="Times New Roman" w:hAnsi="Times New Roman" w:cs="Times New Roman" w:eastAsia="Times New Roman"/>
-                <w:sz w:val="20"/>
-                <w:szCs w:val="20"/>
-              </w:rPr>
-              <w:t xml:space="preserve">11.4%</w:t>
-            </w:r>
-          </w:p>
-        </w:tc>
-      </w:tr>
-      <w:tr>
-        <w:tc>
-          <w:tcPr/>
-          <w:p>
-            <w:pPr>
-              <w:pStyle w:val="Normal"/>
-              <w:jc w:val="left"/>
-              <w:spacing w:line="240" w:lineRule="auto" w:after="0"/>
-            </w:pPr>
-            <w:r>
-              <w:rPr>
-                <w:rFonts w:ascii="Times New Roman" w:hAnsi="Times New Roman" w:cs="Times New Roman" w:eastAsia="Times New Roman"/>
-                <w:sz w:val="20"/>
-                <w:szCs w:val="20"/>
-              </w:rPr>
-              <w:t xml:space="preserve">Smith 1986</w:t>
-            </w:r>
-          </w:p>
-        </w:tc>
-        <w:tc>
-          <w:tcPr/>
-          <w:p>
-            <w:pPr>
-              <w:pStyle w:val="Normal"/>
-              <w:jc w:val="left"/>
-              <w:spacing w:line="240" w:lineRule="auto" w:after="0"/>
-            </w:pPr>
-            <w:r>
-              <w:rPr>
-                <w:rFonts w:ascii="Times New Roman" w:hAnsi="Times New Roman" w:cs="Times New Roman" w:eastAsia="Times New Roman"/>
-                <w:sz w:val="20"/>
-                <w:szCs w:val="20"/>
-              </w:rPr>
-              <w:t xml:space="preserve">1986</w:t>
-            </w:r>
-          </w:p>
-        </w:tc>
-        <w:tc>
-          <w:tcPr/>
-          <w:p>
-            <w:pPr>
-              <w:pStyle w:val="Normal"/>
-              <w:jc w:val="left"/>
-              <w:spacing w:line="240" w:lineRule="auto" w:after="0"/>
-            </w:pPr>
-            <w:r>
-              <w:rPr>
-                <w:rFonts w:ascii="Times New Roman" w:hAnsi="Times New Roman" w:cs="Times New Roman" w:eastAsia="Times New Roman"/>
-                <w:sz w:val="20"/>
-                <w:szCs w:val="20"/>
-              </w:rPr>
-              <w:t xml:space="preserve">Pre-thrombolysis</w:t>
-            </w:r>
-          </w:p>
-        </w:tc>
-        <w:tc>
-          <w:tcPr/>
-          <w:p>
-            <w:pPr>
-              <w:pStyle w:val="Normal"/>
-              <w:jc w:val="left"/>
-              <w:spacing w:line="240" w:lineRule="auto" w:after="0"/>
-            </w:pPr>
-            <w:r>
-              <w:rPr>
-                <w:rFonts w:ascii="Times New Roman" w:hAnsi="Times New Roman" w:cs="Times New Roman" w:eastAsia="Times New Roman"/>
-                <w:sz w:val="20"/>
-                <w:szCs w:val="20"/>
-              </w:rPr>
-              <w:t xml:space="preserve">2</w:t>
-            </w:r>
-          </w:p>
-        </w:tc>
-        <w:tc>
-          <w:tcPr/>
-          <w:p>
-            <w:pPr>
-              <w:pStyle w:val="Normal"/>
-              <w:jc w:val="left"/>
-              <w:spacing w:line="240" w:lineRule="auto" w:after="0"/>
-            </w:pPr>
-            <w:r>
-              <w:rPr>
-                <w:rFonts w:ascii="Times New Roman" w:hAnsi="Times New Roman" w:cs="Times New Roman" w:eastAsia="Times New Roman"/>
-                <w:sz w:val="20"/>
-                <w:szCs w:val="20"/>
-              </w:rPr>
-              <w:t xml:space="preserve">200</w:t>
-            </w:r>
-          </w:p>
-        </w:tc>
-        <w:tc>
-          <w:tcPr/>
-          <w:p>
-            <w:pPr>
-              <w:pStyle w:val="Normal"/>
-              <w:jc w:val="left"/>
-              <w:spacing w:line="240" w:lineRule="auto" w:after="0"/>
-            </w:pPr>
-            <w:r>
-              <w:rPr>
-                <w:rFonts w:ascii="Times New Roman" w:hAnsi="Times New Roman" w:cs="Times New Roman" w:eastAsia="Times New Roman"/>
-                <w:sz w:val="20"/>
-                <w:szCs w:val="20"/>
-              </w:rPr>
-              <w:t xml:space="preserve">7</w:t>
-            </w:r>
-          </w:p>
-        </w:tc>
-        <w:tc>
-          <w:tcPr/>
-          <w:p>
-            <w:pPr>
-              <w:pStyle w:val="Normal"/>
-              <w:jc w:val="left"/>
-              <w:spacing w:line="240" w:lineRule="auto" w:after="0"/>
-            </w:pPr>
-            <w:r>
-              <w:rPr>
-                <w:rFonts w:ascii="Times New Roman" w:hAnsi="Times New Roman" w:cs="Times New Roman" w:eastAsia="Times New Roman"/>
-                <w:sz w:val="20"/>
-                <w:szCs w:val="20"/>
-              </w:rPr>
-              <w:t xml:space="preserve">200</w:t>
-            </w:r>
-          </w:p>
-        </w:tc>
-        <w:tc>
-          <w:tcPr/>
-          <w:p>
-            <w:pPr>
-              <w:pStyle w:val="Normal"/>
-              <w:jc w:val="left"/>
-              <w:spacing w:line="240" w:lineRule="auto" w:after="0"/>
-            </w:pPr>
-            <w:r>
-              <w:rPr>
-                <w:rFonts w:ascii="Times New Roman" w:hAnsi="Times New Roman" w:cs="Times New Roman" w:eastAsia="Times New Roman"/>
-                <w:sz w:val="20"/>
-                <w:szCs w:val="20"/>
-              </w:rPr>
-              <w:t xml:space="preserve">3.5%</w:t>
-            </w:r>
-          </w:p>
-        </w:tc>
-      </w:tr>
-      <w:tr>
-        <w:tc>
-          <w:tcPr/>
-          <w:p>
-            <w:pPr>
-              <w:pStyle w:val="Normal"/>
-              <w:jc w:val="left"/>
-              <w:spacing w:line="240" w:lineRule="auto" w:after="0"/>
-            </w:pPr>
-            <w:r>
-              <w:rPr>
-                <w:rFonts w:ascii="Times New Roman" w:hAnsi="Times New Roman" w:cs="Times New Roman" w:eastAsia="Times New Roman"/>
-                <w:sz w:val="20"/>
-                <w:szCs w:val="20"/>
-              </w:rPr>
-              <w:t xml:space="preserve">Abraham 1987</w:t>
-            </w:r>
-          </w:p>
-        </w:tc>
-        <w:tc>
-          <w:tcPr/>
-          <w:p>
-            <w:pPr>
-              <w:pStyle w:val="Normal"/>
-              <w:jc w:val="left"/>
-              <w:spacing w:line="240" w:lineRule="auto" w:after="0"/>
-            </w:pPr>
-            <w:r>
-              <w:rPr>
-                <w:rFonts w:ascii="Times New Roman" w:hAnsi="Times New Roman" w:cs="Times New Roman" w:eastAsia="Times New Roman"/>
-                <w:sz w:val="20"/>
-                <w:szCs w:val="20"/>
-              </w:rPr>
-              <w:t xml:space="preserve">1987</w:t>
-            </w:r>
-          </w:p>
-        </w:tc>
-        <w:tc>
-          <w:tcPr/>
-          <w:p>
-            <w:pPr>
-              <w:pStyle w:val="Normal"/>
-              <w:jc w:val="left"/>
-              <w:spacing w:line="240" w:lineRule="auto" w:after="0"/>
-            </w:pPr>
-            <w:r>
-              <w:rPr>
-                <w:rFonts w:ascii="Times New Roman" w:hAnsi="Times New Roman" w:cs="Times New Roman" w:eastAsia="Times New Roman"/>
-                <w:sz w:val="20"/>
-                <w:szCs w:val="20"/>
-              </w:rPr>
-              <w:t xml:space="preserve">Pre-thrombolysis</w:t>
-            </w:r>
-          </w:p>
-        </w:tc>
-        <w:tc>
-          <w:tcPr/>
-          <w:p>
-            <w:pPr>
-              <w:pStyle w:val="Normal"/>
-              <w:jc w:val="left"/>
-              <w:spacing w:line="240" w:lineRule="auto" w:after="0"/>
-            </w:pPr>
-            <w:r>
-              <w:rPr>
-                <w:rFonts w:ascii="Times New Roman" w:hAnsi="Times New Roman" w:cs="Times New Roman" w:eastAsia="Times New Roman"/>
-                <w:sz w:val="20"/>
-                <w:szCs w:val="20"/>
-              </w:rPr>
-              <w:t xml:space="preserve">1</w:t>
-            </w:r>
-          </w:p>
-        </w:tc>
-        <w:tc>
-          <w:tcPr/>
-          <w:p>
-            <w:pPr>
-              <w:pStyle w:val="Normal"/>
-              <w:jc w:val="left"/>
-              <w:spacing w:line="240" w:lineRule="auto" w:after="0"/>
-            </w:pPr>
-            <w:r>
-              <w:rPr>
-                <w:rFonts w:ascii="Times New Roman" w:hAnsi="Times New Roman" w:cs="Times New Roman" w:eastAsia="Times New Roman"/>
-                <w:sz w:val="20"/>
-                <w:szCs w:val="20"/>
-              </w:rPr>
-              <w:t xml:space="preserve">48</w:t>
-            </w:r>
-          </w:p>
-        </w:tc>
-        <w:tc>
-          <w:tcPr/>
-          <w:p>
-            <w:pPr>
-              <w:pStyle w:val="Normal"/>
-              <w:jc w:val="left"/>
-              <w:spacing w:line="240" w:lineRule="auto" w:after="0"/>
-            </w:pPr>
-            <w:r>
-              <w:rPr>
-                <w:rFonts w:ascii="Times New Roman" w:hAnsi="Times New Roman" w:cs="Times New Roman" w:eastAsia="Times New Roman"/>
-                <w:sz w:val="20"/>
-                <w:szCs w:val="20"/>
-              </w:rPr>
-              <w:t xml:space="preserve">1</w:t>
-            </w:r>
-          </w:p>
-        </w:tc>
-        <w:tc>
-          <w:tcPr/>
-          <w:p>
-            <w:pPr>
-              <w:pStyle w:val="Normal"/>
-              <w:jc w:val="left"/>
-              <w:spacing w:line="240" w:lineRule="auto" w:after="0"/>
-            </w:pPr>
-            <w:r>
-              <w:rPr>
-                <w:rFonts w:ascii="Times New Roman" w:hAnsi="Times New Roman" w:cs="Times New Roman" w:eastAsia="Times New Roman"/>
-                <w:sz w:val="20"/>
-                <w:szCs w:val="20"/>
-              </w:rPr>
-              <w:t xml:space="preserve">46</w:t>
-            </w:r>
-          </w:p>
-        </w:tc>
-        <w:tc>
-          <w:tcPr/>
-          <w:p>
-            <w:pPr>
-              <w:pStyle w:val="Normal"/>
-              <w:jc w:val="left"/>
-              <w:spacing w:line="240" w:lineRule="auto" w:after="0"/>
-            </w:pPr>
-            <w:r>
-              <w:rPr>
-                <w:rFonts w:ascii="Times New Roman" w:hAnsi="Times New Roman" w:cs="Times New Roman" w:eastAsia="Times New Roman"/>
-                <w:sz w:val="20"/>
-                <w:szCs w:val="20"/>
-              </w:rPr>
-              <w:t xml:space="preserve">2.2%</w:t>
-            </w:r>
-          </w:p>
-        </w:tc>
-      </w:tr>
-      <w:tr>
-        <w:tc>
-          <w:tcPr/>
-          <w:p>
-            <w:pPr>
-              <w:pStyle w:val="Normal"/>
-              <w:jc w:val="left"/>
-              <w:spacing w:line="240" w:lineRule="auto" w:after="0"/>
-            </w:pPr>
-            <w:r>
-              <w:rPr>
-                <w:rFonts w:ascii="Times New Roman" w:hAnsi="Times New Roman" w:cs="Times New Roman" w:eastAsia="Times New Roman"/>
-                <w:sz w:val="20"/>
-                <w:szCs w:val="20"/>
-              </w:rPr>
-              <w:t xml:space="preserve">Ceremuzynski 1989</w:t>
-            </w:r>
-          </w:p>
-        </w:tc>
-        <w:tc>
-          <w:tcPr/>
-          <w:p>
-            <w:pPr>
-              <w:pStyle w:val="Normal"/>
-              <w:jc w:val="left"/>
-              <w:spacing w:line="240" w:lineRule="auto" w:after="0"/>
-            </w:pPr>
-            <w:r>
-              <w:rPr>
-                <w:rFonts w:ascii="Times New Roman" w:hAnsi="Times New Roman" w:cs="Times New Roman" w:eastAsia="Times New Roman"/>
-                <w:sz w:val="20"/>
-                <w:szCs w:val="20"/>
-              </w:rPr>
-              <w:t xml:space="preserve">1989</w:t>
-            </w:r>
-          </w:p>
-        </w:tc>
-        <w:tc>
-          <w:tcPr/>
-          <w:p>
-            <w:pPr>
-              <w:pStyle w:val="Normal"/>
-              <w:jc w:val="left"/>
-              <w:spacing w:line="240" w:lineRule="auto" w:after="0"/>
-            </w:pPr>
-            <w:r>
-              <w:rPr>
-                <w:rFonts w:ascii="Times New Roman" w:hAnsi="Times New Roman" w:cs="Times New Roman" w:eastAsia="Times New Roman"/>
-                <w:sz w:val="20"/>
-                <w:szCs w:val="20"/>
-              </w:rPr>
-              <w:t xml:space="preserve">Pre-thrombolysis</w:t>
-            </w:r>
-          </w:p>
-        </w:tc>
-        <w:tc>
-          <w:tcPr/>
-          <w:p>
-            <w:pPr>
-              <w:pStyle w:val="Normal"/>
-              <w:jc w:val="left"/>
-              <w:spacing w:line="240" w:lineRule="auto" w:after="0"/>
-            </w:pPr>
-            <w:r>
-              <w:rPr>
-                <w:rFonts w:ascii="Times New Roman" w:hAnsi="Times New Roman" w:cs="Times New Roman" w:eastAsia="Times New Roman"/>
-                <w:sz w:val="20"/>
-                <w:szCs w:val="20"/>
-              </w:rPr>
-              <w:t xml:space="preserve">1</w:t>
-            </w:r>
-          </w:p>
-        </w:tc>
-        <w:tc>
-          <w:tcPr/>
-          <w:p>
-            <w:pPr>
-              <w:pStyle w:val="Normal"/>
-              <w:jc w:val="left"/>
-              <w:spacing w:line="240" w:lineRule="auto" w:after="0"/>
-            </w:pPr>
-            <w:r>
-              <w:rPr>
-                <w:rFonts w:ascii="Times New Roman" w:hAnsi="Times New Roman" w:cs="Times New Roman" w:eastAsia="Times New Roman"/>
-                <w:sz w:val="20"/>
-                <w:szCs w:val="20"/>
-              </w:rPr>
-              <w:t xml:space="preserve">25</w:t>
-            </w:r>
-          </w:p>
-        </w:tc>
-        <w:tc>
-          <w:tcPr/>
-          <w:p>
-            <w:pPr>
-              <w:pStyle w:val="Normal"/>
-              <w:jc w:val="left"/>
-              <w:spacing w:line="240" w:lineRule="auto" w:after="0"/>
-            </w:pPr>
-            <w:r>
-              <w:rPr>
-                <w:rFonts w:ascii="Times New Roman" w:hAnsi="Times New Roman" w:cs="Times New Roman" w:eastAsia="Times New Roman"/>
-                <w:sz w:val="20"/>
-                <w:szCs w:val="20"/>
-              </w:rPr>
-              <w:t xml:space="preserve">3</w:t>
-            </w:r>
-          </w:p>
-        </w:tc>
-        <w:tc>
-          <w:tcPr/>
-          <w:p>
-            <w:pPr>
-              <w:pStyle w:val="Normal"/>
-              <w:jc w:val="left"/>
-              <w:spacing w:line="240" w:lineRule="auto" w:after="0"/>
-            </w:pPr>
-            <w:r>
-              <w:rPr>
-                <w:rFonts w:ascii="Times New Roman" w:hAnsi="Times New Roman" w:cs="Times New Roman" w:eastAsia="Times New Roman"/>
-                <w:sz w:val="20"/>
-                <w:szCs w:val="20"/>
-              </w:rPr>
-              <w:t xml:space="preserve">23</w:t>
-            </w:r>
-          </w:p>
-        </w:tc>
-        <w:tc>
-          <w:tcPr/>
-          <w:p>
-            <w:pPr>
-              <w:pStyle w:val="Normal"/>
-              <w:jc w:val="left"/>
-              <w:spacing w:line="240" w:lineRule="auto" w:after="0"/>
-            </w:pPr>
-            <w:r>
-              <w:rPr>
-                <w:rFonts w:ascii="Times New Roman" w:hAnsi="Times New Roman" w:cs="Times New Roman" w:eastAsia="Times New Roman"/>
-                <w:sz w:val="20"/>
-                <w:szCs w:val="20"/>
-              </w:rPr>
-              <w:t xml:space="preserve">13.0%</w:t>
-            </w:r>
-          </w:p>
-        </w:tc>
-      </w:tr>
-      <w:tr>
-        <w:tc>
-          <w:tcPr/>
-          <w:p>
-            <w:pPr>
-              <w:pStyle w:val="Normal"/>
-              <w:jc w:val="left"/>
-              <w:spacing w:line="240" w:lineRule="auto" w:after="0"/>
-            </w:pPr>
-            <w:r>
-              <w:rPr>
-                <w:rFonts w:ascii="Times New Roman" w:hAnsi="Times New Roman" w:cs="Times New Roman" w:eastAsia="Times New Roman"/>
-                <w:sz w:val="20"/>
-                <w:szCs w:val="20"/>
-              </w:rPr>
-              <w:t xml:space="preserve">Shechter 1990</w:t>
-            </w:r>
-          </w:p>
-        </w:tc>
-        <w:tc>
-          <w:tcPr/>
-          <w:p>
-            <w:pPr>
-              <w:pStyle w:val="Normal"/>
-              <w:jc w:val="left"/>
-              <w:spacing w:line="240" w:lineRule="auto" w:after="0"/>
-            </w:pPr>
-            <w:r>
-              <w:rPr>
-                <w:rFonts w:ascii="Times New Roman" w:hAnsi="Times New Roman" w:cs="Times New Roman" w:eastAsia="Times New Roman"/>
-                <w:sz w:val="20"/>
-                <w:szCs w:val="20"/>
-              </w:rPr>
-              <w:t xml:space="preserve">1990</w:t>
-            </w:r>
-          </w:p>
-        </w:tc>
-        <w:tc>
-          <w:tcPr/>
-          <w:p>
-            <w:pPr>
-              <w:pStyle w:val="Normal"/>
-              <w:jc w:val="left"/>
-              <w:spacing w:line="240" w:lineRule="auto" w:after="0"/>
-            </w:pPr>
-            <w:r>
-              <w:rPr>
-                <w:rFonts w:ascii="Times New Roman" w:hAnsi="Times New Roman" w:cs="Times New Roman" w:eastAsia="Times New Roman"/>
-                <w:sz w:val="20"/>
-                <w:szCs w:val="20"/>
-              </w:rPr>
-              <w:t xml:space="preserve">Pre-thrombolysis</w:t>
-            </w:r>
-          </w:p>
-        </w:tc>
-        <w:tc>
-          <w:tcPr/>
-          <w:p>
-            <w:pPr>
-              <w:pStyle w:val="Normal"/>
-              <w:jc w:val="left"/>
-              <w:spacing w:line="240" w:lineRule="auto" w:after="0"/>
-            </w:pPr>
-            <w:r>
-              <w:rPr>
-                <w:rFonts w:ascii="Times New Roman" w:hAnsi="Times New Roman" w:cs="Times New Roman" w:eastAsia="Times New Roman"/>
-                <w:sz w:val="20"/>
-                <w:szCs w:val="20"/>
-              </w:rPr>
-              <w:t xml:space="preserve">1</w:t>
-            </w:r>
-          </w:p>
-        </w:tc>
-        <w:tc>
-          <w:tcPr/>
-          <w:p>
-            <w:pPr>
-              <w:pStyle w:val="Normal"/>
-              <w:jc w:val="left"/>
-              <w:spacing w:line="240" w:lineRule="auto" w:after="0"/>
-            </w:pPr>
-            <w:r>
-              <w:rPr>
-                <w:rFonts w:ascii="Times New Roman" w:hAnsi="Times New Roman" w:cs="Times New Roman" w:eastAsia="Times New Roman"/>
-                <w:sz w:val="20"/>
-                <w:szCs w:val="20"/>
-              </w:rPr>
-              <w:t xml:space="preserve">50</w:t>
-            </w:r>
-          </w:p>
-        </w:tc>
-        <w:tc>
-          <w:tcPr/>
-          <w:p>
-            <w:pPr>
-              <w:pStyle w:val="Normal"/>
-              <w:jc w:val="left"/>
-              <w:spacing w:line="240" w:lineRule="auto" w:after="0"/>
-            </w:pPr>
-            <w:r>
-              <w:rPr>
-                <w:rFonts w:ascii="Times New Roman" w:hAnsi="Times New Roman" w:cs="Times New Roman" w:eastAsia="Times New Roman"/>
-                <w:sz w:val="20"/>
-                <w:szCs w:val="20"/>
-              </w:rPr>
-              <w:t xml:space="preserve">9</w:t>
-            </w:r>
-          </w:p>
-        </w:tc>
-        <w:tc>
-          <w:tcPr/>
-          <w:p>
-            <w:pPr>
-              <w:pStyle w:val="Normal"/>
-              <w:jc w:val="left"/>
-              <w:spacing w:line="240" w:lineRule="auto" w:after="0"/>
-            </w:pPr>
-            <w:r>
-              <w:rPr>
-                <w:rFonts w:ascii="Times New Roman" w:hAnsi="Times New Roman" w:cs="Times New Roman" w:eastAsia="Times New Roman"/>
-                <w:sz w:val="20"/>
-                <w:szCs w:val="20"/>
-              </w:rPr>
-              <w:t xml:space="preserve">53</w:t>
-            </w:r>
-          </w:p>
-        </w:tc>
-        <w:tc>
-          <w:tcPr/>
-          <w:p>
-            <w:pPr>
-              <w:pStyle w:val="Normal"/>
-              <w:jc w:val="left"/>
-              <w:spacing w:line="240" w:lineRule="auto" w:after="0"/>
-            </w:pPr>
-            <w:r>
-              <w:rPr>
-                <w:rFonts w:ascii="Times New Roman" w:hAnsi="Times New Roman" w:cs="Times New Roman" w:eastAsia="Times New Roman"/>
-                <w:sz w:val="20"/>
-                <w:szCs w:val="20"/>
-              </w:rPr>
-              <w:t xml:space="preserve">17.0%</w:t>
-            </w:r>
-          </w:p>
-        </w:tc>
-      </w:tr>
-      <w:tr>
-        <w:tc>
-          <w:tcPr/>
-          <w:p>
-            <w:pPr>
-              <w:pStyle w:val="Normal"/>
-              <w:jc w:val="left"/>
-              <w:spacing w:line="240" w:lineRule="auto" w:after="0"/>
-            </w:pPr>
-            <w:r>
-              <w:rPr>
-                <w:rFonts w:ascii="Times New Roman" w:hAnsi="Times New Roman" w:cs="Times New Roman" w:eastAsia="Times New Roman"/>
-                <w:sz w:val="20"/>
-                <w:szCs w:val="20"/>
-              </w:rPr>
-              <w:t xml:space="preserve">Singh 1990</w:t>
-            </w:r>
-          </w:p>
-        </w:tc>
-        <w:tc>
-          <w:tcPr/>
-          <w:p>
-            <w:pPr>
-              <w:pStyle w:val="Normal"/>
-              <w:jc w:val="left"/>
-              <w:spacing w:line="240" w:lineRule="auto" w:after="0"/>
-            </w:pPr>
-            <w:r>
-              <w:rPr>
-                <w:rFonts w:ascii="Times New Roman" w:hAnsi="Times New Roman" w:cs="Times New Roman" w:eastAsia="Times New Roman"/>
-                <w:sz w:val="20"/>
-                <w:szCs w:val="20"/>
-              </w:rPr>
-              <w:t xml:space="preserve">1990</w:t>
-            </w:r>
-          </w:p>
-        </w:tc>
-        <w:tc>
-          <w:tcPr/>
-          <w:p>
-            <w:pPr>
-              <w:pStyle w:val="Normal"/>
-              <w:jc w:val="left"/>
-              <w:spacing w:line="240" w:lineRule="auto" w:after="0"/>
-            </w:pPr>
-            <w:r>
-              <w:rPr>
-                <w:rFonts w:ascii="Times New Roman" w:hAnsi="Times New Roman" w:cs="Times New Roman" w:eastAsia="Times New Roman"/>
-                <w:sz w:val="20"/>
-                <w:szCs w:val="20"/>
-              </w:rPr>
-              <w:t xml:space="preserve">Pre-thrombolysis</w:t>
-            </w:r>
-          </w:p>
-        </w:tc>
-        <w:tc>
-          <w:tcPr/>
-          <w:p>
-            <w:pPr>
-              <w:pStyle w:val="Normal"/>
-              <w:jc w:val="left"/>
-              <w:spacing w:line="240" w:lineRule="auto" w:after="0"/>
-            </w:pPr>
-            <w:r>
-              <w:rPr>
-                <w:rFonts w:ascii="Times New Roman" w:hAnsi="Times New Roman" w:cs="Times New Roman" w:eastAsia="Times New Roman"/>
-                <w:sz w:val="20"/>
-                <w:szCs w:val="20"/>
-              </w:rPr>
-              <w:t xml:space="preserve">6</w:t>
-            </w:r>
-          </w:p>
-        </w:tc>
-        <w:tc>
-          <w:tcPr/>
-          <w:p>
-            <w:pPr>
-              <w:pStyle w:val="Normal"/>
-              <w:jc w:val="left"/>
-              <w:spacing w:line="240" w:lineRule="auto" w:after="0"/>
-            </w:pPr>
-            <w:r>
-              <w:rPr>
-                <w:rFonts w:ascii="Times New Roman" w:hAnsi="Times New Roman" w:cs="Times New Roman" w:eastAsia="Times New Roman"/>
-                <w:sz w:val="20"/>
-                <w:szCs w:val="20"/>
-              </w:rPr>
-              <w:t xml:space="preserve">39</w:t>
-            </w:r>
-          </w:p>
-        </w:tc>
-        <w:tc>
-          <w:tcPr/>
-          <w:p>
-            <w:pPr>
-              <w:pStyle w:val="Normal"/>
-              <w:jc w:val="left"/>
-              <w:spacing w:line="240" w:lineRule="auto" w:after="0"/>
-            </w:pPr>
-            <w:r>
-              <w:rPr>
-                <w:rFonts w:ascii="Times New Roman" w:hAnsi="Times New Roman" w:cs="Times New Roman" w:eastAsia="Times New Roman"/>
-                <w:sz w:val="20"/>
-                <w:szCs w:val="20"/>
-              </w:rPr>
-              <w:t xml:space="preserve">11</w:t>
-            </w:r>
-          </w:p>
-        </w:tc>
-        <w:tc>
-          <w:tcPr/>
-          <w:p>
-            <w:pPr>
-              <w:pStyle w:val="Normal"/>
-              <w:jc w:val="left"/>
-              <w:spacing w:line="240" w:lineRule="auto" w:after="0"/>
-            </w:pPr>
-            <w:r>
-              <w:rPr>
-                <w:rFonts w:ascii="Times New Roman" w:hAnsi="Times New Roman" w:cs="Times New Roman" w:eastAsia="Times New Roman"/>
-                <w:sz w:val="20"/>
-                <w:szCs w:val="20"/>
-              </w:rPr>
-              <w:t xml:space="preserve">37</w:t>
-            </w:r>
-          </w:p>
-        </w:tc>
-        <w:tc>
-          <w:tcPr/>
-          <w:p>
-            <w:pPr>
-              <w:pStyle w:val="Normal"/>
-              <w:jc w:val="left"/>
-              <w:spacing w:line="240" w:lineRule="auto" w:after="0"/>
-            </w:pPr>
-            <w:r>
-              <w:rPr>
-                <w:rFonts w:ascii="Times New Roman" w:hAnsi="Times New Roman" w:cs="Times New Roman" w:eastAsia="Times New Roman"/>
-                <w:sz w:val="20"/>
-                <w:szCs w:val="20"/>
-              </w:rPr>
-              <w:t xml:space="preserve">29.7%</w:t>
-            </w:r>
-          </w:p>
-        </w:tc>
-      </w:tr>
-      <w:tr>
-        <w:tc>
-          <w:tcPr/>
-          <w:p>
-            <w:pPr>
-              <w:pStyle w:val="Normal"/>
-              <w:jc w:val="left"/>
-              <w:spacing w:line="240" w:lineRule="auto" w:after="0"/>
-            </w:pPr>
-            <w:r>
-              <w:rPr>
-                <w:rFonts w:ascii="Times New Roman" w:hAnsi="Times New Roman" w:cs="Times New Roman" w:eastAsia="Times New Roman"/>
-                <w:sz w:val="20"/>
-                <w:szCs w:val="20"/>
-              </w:rPr>
-              <w:t xml:space="preserve">Feldstedt 1991</w:t>
-            </w:r>
-          </w:p>
-        </w:tc>
-        <w:tc>
-          <w:tcPr/>
-          <w:p>
-            <w:pPr>
-              <w:pStyle w:val="Normal"/>
-              <w:jc w:val="left"/>
-              <w:spacing w:line="240" w:lineRule="auto" w:after="0"/>
-            </w:pPr>
-            <w:r>
-              <w:rPr>
-                <w:rFonts w:ascii="Times New Roman" w:hAnsi="Times New Roman" w:cs="Times New Roman" w:eastAsia="Times New Roman"/>
-                <w:sz w:val="20"/>
-                <w:szCs w:val="20"/>
-              </w:rPr>
-              <w:t xml:space="preserve">1991</w:t>
-            </w:r>
-          </w:p>
-        </w:tc>
-        <w:tc>
-          <w:tcPr/>
-          <w:p>
-            <w:pPr>
-              <w:pStyle w:val="Normal"/>
-              <w:jc w:val="left"/>
-              <w:spacing w:line="240" w:lineRule="auto" w:after="0"/>
-            </w:pPr>
-            <w:r>
-              <w:rPr>
-                <w:rFonts w:ascii="Times New Roman" w:hAnsi="Times New Roman" w:cs="Times New Roman" w:eastAsia="Times New Roman"/>
-                <w:sz w:val="20"/>
-                <w:szCs w:val="20"/>
-              </w:rPr>
-              <w:t xml:space="preserve">Transition</w:t>
-            </w:r>
-          </w:p>
-        </w:tc>
-        <w:tc>
-          <w:tcPr/>
-          <w:p>
-            <w:pPr>
-              <w:pStyle w:val="Normal"/>
-              <w:jc w:val="left"/>
-              <w:spacing w:line="240" w:lineRule="auto" w:after="0"/>
-            </w:pPr>
-            <w:r>
-              <w:rPr>
-                <w:rFonts w:ascii="Times New Roman" w:hAnsi="Times New Roman" w:cs="Times New Roman" w:eastAsia="Times New Roman"/>
-                <w:sz w:val="20"/>
-                <w:szCs w:val="20"/>
-              </w:rPr>
-              <w:t xml:space="preserve">4</w:t>
-            </w:r>
-          </w:p>
-        </w:tc>
-        <w:tc>
-          <w:tcPr/>
-          <w:p>
-            <w:pPr>
-              <w:pStyle w:val="Normal"/>
-              <w:jc w:val="left"/>
-              <w:spacing w:line="240" w:lineRule="auto" w:after="0"/>
-            </w:pPr>
-            <w:r>
-              <w:rPr>
-                <w:rFonts w:ascii="Times New Roman" w:hAnsi="Times New Roman" w:cs="Times New Roman" w:eastAsia="Times New Roman"/>
-                <w:sz w:val="20"/>
-                <w:szCs w:val="20"/>
-              </w:rPr>
-              <w:t xml:space="preserve">100</w:t>
-            </w:r>
-          </w:p>
-        </w:tc>
-        <w:tc>
-          <w:tcPr/>
-          <w:p>
-            <w:pPr>
-              <w:pStyle w:val="Normal"/>
-              <w:jc w:val="left"/>
-              <w:spacing w:line="240" w:lineRule="auto" w:after="0"/>
-            </w:pPr>
-            <w:r>
-              <w:rPr>
-                <w:rFonts w:ascii="Times New Roman" w:hAnsi="Times New Roman" w:cs="Times New Roman" w:eastAsia="Times New Roman"/>
-                <w:sz w:val="20"/>
-                <w:szCs w:val="20"/>
-              </w:rPr>
-              <w:t xml:space="preserve">7</w:t>
-            </w:r>
-          </w:p>
-        </w:tc>
-        <w:tc>
-          <w:tcPr/>
-          <w:p>
-            <w:pPr>
-              <w:pStyle w:val="Normal"/>
-              <w:jc w:val="left"/>
-              <w:spacing w:line="240" w:lineRule="auto" w:after="0"/>
-            </w:pPr>
-            <w:r>
-              <w:rPr>
-                <w:rFonts w:ascii="Times New Roman" w:hAnsi="Times New Roman" w:cs="Times New Roman" w:eastAsia="Times New Roman"/>
-                <w:sz w:val="20"/>
-                <w:szCs w:val="20"/>
-              </w:rPr>
-              <w:t xml:space="preserve">100</w:t>
-            </w:r>
-          </w:p>
-        </w:tc>
-        <w:tc>
-          <w:tcPr/>
-          <w:p>
-            <w:pPr>
-              <w:pStyle w:val="Normal"/>
-              <w:jc w:val="left"/>
-              <w:spacing w:line="240" w:lineRule="auto" w:after="0"/>
-            </w:pPr>
-            <w:r>
-              <w:rPr>
-                <w:rFonts w:ascii="Times New Roman" w:hAnsi="Times New Roman" w:cs="Times New Roman" w:eastAsia="Times New Roman"/>
-                <w:sz w:val="20"/>
-                <w:szCs w:val="20"/>
-              </w:rPr>
-              <w:t xml:space="preserve">7.0%</w:t>
-            </w:r>
-          </w:p>
-        </w:tc>
-      </w:tr>
-      <w:tr>
-        <w:tc>
-          <w:tcPr/>
-          <w:p>
-            <w:pPr>
-              <w:pStyle w:val="Normal"/>
-              <w:jc w:val="left"/>
-              <w:spacing w:line="240" w:lineRule="auto" w:after="0"/>
-            </w:pPr>
-            <w:r>
-              <w:rPr>
-                <w:rFonts w:ascii="Times New Roman" w:hAnsi="Times New Roman" w:cs="Times New Roman" w:eastAsia="Times New Roman"/>
-                <w:sz w:val="20"/>
-                <w:szCs w:val="20"/>
-              </w:rPr>
-              <w:t xml:space="preserve">Schechter 1991</w:t>
-            </w:r>
-          </w:p>
-        </w:tc>
-        <w:tc>
-          <w:tcPr/>
-          <w:p>
-            <w:pPr>
-              <w:pStyle w:val="Normal"/>
-              <w:jc w:val="left"/>
-              <w:spacing w:line="240" w:lineRule="auto" w:after="0"/>
-            </w:pPr>
-            <w:r>
-              <w:rPr>
-                <w:rFonts w:ascii="Times New Roman" w:hAnsi="Times New Roman" w:cs="Times New Roman" w:eastAsia="Times New Roman"/>
-                <w:sz w:val="20"/>
-                <w:szCs w:val="20"/>
-              </w:rPr>
-              <w:t xml:space="preserve">1991</w:t>
-            </w:r>
-          </w:p>
-        </w:tc>
-        <w:tc>
-          <w:tcPr/>
-          <w:p>
-            <w:pPr>
-              <w:pStyle w:val="Normal"/>
-              <w:jc w:val="left"/>
-              <w:spacing w:line="240" w:lineRule="auto" w:after="0"/>
-            </w:pPr>
-            <w:r>
-              <w:rPr>
-                <w:rFonts w:ascii="Times New Roman" w:hAnsi="Times New Roman" w:cs="Times New Roman" w:eastAsia="Times New Roman"/>
-                <w:sz w:val="20"/>
-                <w:szCs w:val="20"/>
-              </w:rPr>
-              <w:t xml:space="preserve">Transition</w:t>
-            </w:r>
-          </w:p>
-        </w:tc>
-        <w:tc>
-          <w:tcPr/>
-          <w:p>
-            <w:pPr>
-              <w:pStyle w:val="Normal"/>
-              <w:jc w:val="left"/>
-              <w:spacing w:line="240" w:lineRule="auto" w:after="0"/>
-            </w:pPr>
-            <w:r>
-              <w:rPr>
-                <w:rFonts w:ascii="Times New Roman" w:hAnsi="Times New Roman" w:cs="Times New Roman" w:eastAsia="Times New Roman"/>
-                <w:sz w:val="20"/>
-                <w:szCs w:val="20"/>
-              </w:rPr>
-              <w:t xml:space="preserve">1</w:t>
-            </w:r>
-          </w:p>
-        </w:tc>
-        <w:tc>
-          <w:tcPr/>
-          <w:p>
-            <w:pPr>
-              <w:pStyle w:val="Normal"/>
-              <w:jc w:val="left"/>
-              <w:spacing w:line="240" w:lineRule="auto" w:after="0"/>
-            </w:pPr>
-            <w:r>
-              <w:rPr>
-                <w:rFonts w:ascii="Times New Roman" w:hAnsi="Times New Roman" w:cs="Times New Roman" w:eastAsia="Times New Roman"/>
-                <w:sz w:val="20"/>
-                <w:szCs w:val="20"/>
-              </w:rPr>
-              <w:t xml:space="preserve">59</w:t>
-            </w:r>
-          </w:p>
-        </w:tc>
-        <w:tc>
-          <w:tcPr/>
-          <w:p>
-            <w:pPr>
-              <w:pStyle w:val="Normal"/>
-              <w:jc w:val="left"/>
-              <w:spacing w:line="240" w:lineRule="auto" w:after="0"/>
-            </w:pPr>
-            <w:r>
-              <w:rPr>
-                <w:rFonts w:ascii="Times New Roman" w:hAnsi="Times New Roman" w:cs="Times New Roman" w:eastAsia="Times New Roman"/>
-                <w:sz w:val="20"/>
-                <w:szCs w:val="20"/>
-              </w:rPr>
-              <w:t xml:space="preserve">2</w:t>
-            </w:r>
-          </w:p>
-        </w:tc>
-        <w:tc>
-          <w:tcPr/>
-          <w:p>
-            <w:pPr>
-              <w:pStyle w:val="Normal"/>
-              <w:jc w:val="left"/>
-              <w:spacing w:line="240" w:lineRule="auto" w:after="0"/>
-            </w:pPr>
-            <w:r>
-              <w:rPr>
-                <w:rFonts w:ascii="Times New Roman" w:hAnsi="Times New Roman" w:cs="Times New Roman" w:eastAsia="Times New Roman"/>
-                <w:sz w:val="20"/>
-                <w:szCs w:val="20"/>
-              </w:rPr>
-              <w:t xml:space="preserve">57</w:t>
-            </w:r>
-          </w:p>
-        </w:tc>
-        <w:tc>
-          <w:tcPr/>
-          <w:p>
-            <w:pPr>
-              <w:pStyle w:val="Normal"/>
-              <w:jc w:val="left"/>
-              <w:spacing w:line="240" w:lineRule="auto" w:after="0"/>
-            </w:pPr>
-            <w:r>
-              <w:rPr>
-                <w:rFonts w:ascii="Times New Roman" w:hAnsi="Times New Roman" w:cs="Times New Roman" w:eastAsia="Times New Roman"/>
-                <w:sz w:val="20"/>
-                <w:szCs w:val="20"/>
-              </w:rPr>
-              <w:t xml:space="preserve">3.5%</w:t>
-            </w:r>
-          </w:p>
-        </w:tc>
-      </w:tr>
-      <w:tr>
-        <w:tc>
-          <w:tcPr/>
-          <w:p>
-            <w:pPr>
-              <w:pStyle w:val="Normal"/>
-              <w:jc w:val="left"/>
-              <w:spacing w:line="240" w:lineRule="auto" w:after="0"/>
-            </w:pPr>
-            <w:r>
-              <w:rPr>
-                <w:rFonts w:ascii="Times New Roman" w:hAnsi="Times New Roman" w:cs="Times New Roman" w:eastAsia="Times New Roman"/>
-                <w:sz w:val="20"/>
-                <w:szCs w:val="20"/>
-              </w:rPr>
-              <w:t xml:space="preserve">LIMIT-2 1992</w:t>
-            </w:r>
-          </w:p>
-        </w:tc>
-        <w:tc>
-          <w:tcPr/>
-          <w:p>
-            <w:pPr>
-              <w:pStyle w:val="Normal"/>
-              <w:jc w:val="left"/>
-              <w:spacing w:line="240" w:lineRule="auto" w:after="0"/>
-            </w:pPr>
-            <w:r>
-              <w:rPr>
-                <w:rFonts w:ascii="Times New Roman" w:hAnsi="Times New Roman" w:cs="Times New Roman" w:eastAsia="Times New Roman"/>
-                <w:sz w:val="20"/>
-                <w:szCs w:val="20"/>
-              </w:rPr>
-              <w:t xml:space="preserve">1992</w:t>
-            </w:r>
-          </w:p>
-        </w:tc>
-        <w:tc>
-          <w:tcPr/>
-          <w:p>
-            <w:pPr>
-              <w:pStyle w:val="Normal"/>
-              <w:jc w:val="left"/>
-              <w:spacing w:line="240" w:lineRule="auto" w:after="0"/>
-            </w:pPr>
-            <w:r>
-              <w:rPr>
-                <w:rFonts w:ascii="Times New Roman" w:hAnsi="Times New Roman" w:cs="Times New Roman" w:eastAsia="Times New Roman"/>
-                <w:sz w:val="20"/>
-                <w:szCs w:val="20"/>
-              </w:rPr>
-              <w:t xml:space="preserve">Thrombolysis</w:t>
-            </w:r>
-          </w:p>
-        </w:tc>
-        <w:tc>
-          <w:tcPr/>
-          <w:p>
-            <w:pPr>
-              <w:pStyle w:val="Normal"/>
-              <w:jc w:val="left"/>
-              <w:spacing w:line="240" w:lineRule="auto" w:after="0"/>
-            </w:pPr>
-            <w:r>
-              <w:rPr>
-                <w:rFonts w:ascii="Times New Roman" w:hAnsi="Times New Roman" w:cs="Times New Roman" w:eastAsia="Times New Roman"/>
-                <w:sz w:val="20"/>
-                <w:szCs w:val="20"/>
-              </w:rPr>
-              <w:t xml:space="preserve">90</w:t>
-            </w:r>
-          </w:p>
-        </w:tc>
-        <w:tc>
-          <w:tcPr/>
-          <w:p>
-            <w:pPr>
-              <w:pStyle w:val="Normal"/>
-              <w:jc w:val="left"/>
-              <w:spacing w:line="240" w:lineRule="auto" w:after="0"/>
-            </w:pPr>
-            <w:r>
-              <w:rPr>
-                <w:rFonts w:ascii="Times New Roman" w:hAnsi="Times New Roman" w:cs="Times New Roman" w:eastAsia="Times New Roman"/>
-                <w:sz w:val="20"/>
-                <w:szCs w:val="20"/>
-              </w:rPr>
-              <w:t xml:space="preserve">1,159</w:t>
-            </w:r>
-          </w:p>
-        </w:tc>
-        <w:tc>
-          <w:tcPr/>
-          <w:p>
-            <w:pPr>
-              <w:pStyle w:val="Normal"/>
-              <w:jc w:val="left"/>
-              <w:spacing w:line="240" w:lineRule="auto" w:after="0"/>
-            </w:pPr>
-            <w:r>
-              <w:rPr>
-                <w:rFonts w:ascii="Times New Roman" w:hAnsi="Times New Roman" w:cs="Times New Roman" w:eastAsia="Times New Roman"/>
-                <w:sz w:val="20"/>
-                <w:szCs w:val="20"/>
-              </w:rPr>
-              <w:t xml:space="preserve">118</w:t>
-            </w:r>
-          </w:p>
-        </w:tc>
-        <w:tc>
-          <w:tcPr/>
-          <w:p>
-            <w:pPr>
-              <w:pStyle w:val="Normal"/>
-              <w:jc w:val="left"/>
-              <w:spacing w:line="240" w:lineRule="auto" w:after="0"/>
-            </w:pPr>
-            <w:r>
-              <w:rPr>
-                <w:rFonts w:ascii="Times New Roman" w:hAnsi="Times New Roman" w:cs="Times New Roman" w:eastAsia="Times New Roman"/>
-                <w:sz w:val="20"/>
-                <w:szCs w:val="20"/>
-              </w:rPr>
-              <w:t xml:space="preserve">1,157</w:t>
-            </w:r>
-          </w:p>
-        </w:tc>
-        <w:tc>
-          <w:tcPr/>
-          <w:p>
-            <w:pPr>
-              <w:pStyle w:val="Normal"/>
-              <w:jc w:val="left"/>
-              <w:spacing w:line="240" w:lineRule="auto" w:after="0"/>
-            </w:pPr>
-            <w:r>
-              <w:rPr>
-                <w:rFonts w:ascii="Times New Roman" w:hAnsi="Times New Roman" w:cs="Times New Roman" w:eastAsia="Times New Roman"/>
-                <w:sz w:val="20"/>
-                <w:szCs w:val="20"/>
-              </w:rPr>
-              <w:t xml:space="preserve">10.2%</w:t>
-            </w:r>
-          </w:p>
-        </w:tc>
-      </w:tr>
-      <w:tr>
-        <w:tc>
-          <w:tcPr/>
-          <w:p>
-            <w:pPr>
-              <w:pStyle w:val="Normal"/>
-              <w:jc w:val="left"/>
-              <w:spacing w:line="240" w:lineRule="auto" w:after="0"/>
-            </w:pPr>
-            <w:r>
-              <w:rPr>
-                <w:rFonts w:ascii="Times New Roman" w:hAnsi="Times New Roman" w:cs="Times New Roman" w:eastAsia="Times New Roman"/>
-                <w:sz w:val="20"/>
-                <w:szCs w:val="20"/>
-              </w:rPr>
-              <w:t xml:space="preserve">Shechter 1995</w:t>
-            </w:r>
-          </w:p>
-        </w:tc>
-        <w:tc>
-          <w:tcPr/>
-          <w:p>
-            <w:pPr>
-              <w:pStyle w:val="Normal"/>
-              <w:jc w:val="left"/>
-              <w:spacing w:line="240" w:lineRule="auto" w:after="0"/>
-            </w:pPr>
-            <w:r>
-              <w:rPr>
-                <w:rFonts w:ascii="Times New Roman" w:hAnsi="Times New Roman" w:cs="Times New Roman" w:eastAsia="Times New Roman"/>
-                <w:sz w:val="20"/>
-                <w:szCs w:val="20"/>
-              </w:rPr>
-              <w:t xml:space="preserve">1995</w:t>
-            </w:r>
-          </w:p>
-        </w:tc>
-        <w:tc>
-          <w:tcPr/>
-          <w:p>
-            <w:pPr>
-              <w:pStyle w:val="Normal"/>
-              <w:jc w:val="left"/>
-              <w:spacing w:line="240" w:lineRule="auto" w:after="0"/>
-            </w:pPr>
-            <w:r>
-              <w:rPr>
-                <w:rFonts w:ascii="Times New Roman" w:hAnsi="Times New Roman" w:cs="Times New Roman" w:eastAsia="Times New Roman"/>
-                <w:sz w:val="20"/>
-                <w:szCs w:val="20"/>
-              </w:rPr>
-              <w:t xml:space="preserve">Thrombolysis</w:t>
-            </w:r>
-          </w:p>
-        </w:tc>
-        <w:tc>
-          <w:tcPr/>
-          <w:p>
-            <w:pPr>
-              <w:pStyle w:val="Normal"/>
-              <w:jc w:val="left"/>
-              <w:spacing w:line="240" w:lineRule="auto" w:after="0"/>
-            </w:pPr>
-            <w:r>
-              <w:rPr>
-                <w:rFonts w:ascii="Times New Roman" w:hAnsi="Times New Roman" w:cs="Times New Roman" w:eastAsia="Times New Roman"/>
-                <w:sz w:val="20"/>
-                <w:szCs w:val="20"/>
-              </w:rPr>
-              <w:t xml:space="preserve">4</w:t>
-            </w:r>
-          </w:p>
-        </w:tc>
-        <w:tc>
-          <w:tcPr/>
-          <w:p>
-            <w:pPr>
-              <w:pStyle w:val="Normal"/>
-              <w:jc w:val="left"/>
-              <w:spacing w:line="240" w:lineRule="auto" w:after="0"/>
-            </w:pPr>
-            <w:r>
-              <w:rPr>
-                <w:rFonts w:ascii="Times New Roman" w:hAnsi="Times New Roman" w:cs="Times New Roman" w:eastAsia="Times New Roman"/>
-                <w:sz w:val="20"/>
-                <w:szCs w:val="20"/>
-              </w:rPr>
-              <w:t xml:space="preserve">107</w:t>
-            </w:r>
-          </w:p>
-        </w:tc>
-        <w:tc>
-          <w:tcPr/>
-          <w:p>
-            <w:pPr>
-              <w:pStyle w:val="Normal"/>
-              <w:jc w:val="left"/>
-              <w:spacing w:line="240" w:lineRule="auto" w:after="0"/>
-            </w:pPr>
-            <w:r>
-              <w:rPr>
-                <w:rFonts w:ascii="Times New Roman" w:hAnsi="Times New Roman" w:cs="Times New Roman" w:eastAsia="Times New Roman"/>
-                <w:sz w:val="20"/>
-                <w:szCs w:val="20"/>
-              </w:rPr>
-              <w:t xml:space="preserve">17</w:t>
-            </w:r>
-          </w:p>
-        </w:tc>
-        <w:tc>
-          <w:tcPr/>
-          <w:p>
-            <w:pPr>
-              <w:pStyle w:val="Normal"/>
-              <w:jc w:val="left"/>
-              <w:spacing w:line="240" w:lineRule="auto" w:after="0"/>
-            </w:pPr>
-            <w:r>
-              <w:rPr>
-                <w:rFonts w:ascii="Times New Roman" w:hAnsi="Times New Roman" w:cs="Times New Roman" w:eastAsia="Times New Roman"/>
-                <w:sz w:val="20"/>
-                <w:szCs w:val="20"/>
-              </w:rPr>
-              <w:t xml:space="preserve">108</w:t>
-            </w:r>
-          </w:p>
-        </w:tc>
-        <w:tc>
-          <w:tcPr/>
-          <w:p>
-            <w:pPr>
-              <w:pStyle w:val="Normal"/>
-              <w:jc w:val="left"/>
-              <w:spacing w:line="240" w:lineRule="auto" w:after="0"/>
-            </w:pPr>
-            <w:r>
-              <w:rPr>
-                <w:rFonts w:ascii="Times New Roman" w:hAnsi="Times New Roman" w:cs="Times New Roman" w:eastAsia="Times New Roman"/>
-                <w:sz w:val="20"/>
-                <w:szCs w:val="20"/>
-              </w:rPr>
-              <w:t xml:space="preserve">15.7%</w:t>
-            </w:r>
-          </w:p>
-        </w:tc>
-      </w:tr>
-      <w:tr>
-        <w:tc>
-          <w:tcPr/>
-          <w:p>
-            <w:pPr>
-              <w:pStyle w:val="Normal"/>
-              <w:jc w:val="left"/>
-              <w:spacing w:line="240" w:lineRule="auto" w:after="0"/>
-            </w:pPr>
-            <w:r>
-              <w:rPr>
-                <w:rFonts w:ascii="Times New Roman" w:hAnsi="Times New Roman" w:cs="Times New Roman" w:eastAsia="Times New Roman"/>
-                <w:sz w:val="20"/>
-                <w:szCs w:val="20"/>
-              </w:rPr>
-              <w:t xml:space="preserve">ISIS-4 1995</w:t>
-            </w:r>
-          </w:p>
-        </w:tc>
-        <w:tc>
-          <w:tcPr/>
-          <w:p>
-            <w:pPr>
-              <w:pStyle w:val="Normal"/>
-              <w:jc w:val="left"/>
-              <w:spacing w:line="240" w:lineRule="auto" w:after="0"/>
-            </w:pPr>
-            <w:r>
-              <w:rPr>
-                <w:rFonts w:ascii="Times New Roman" w:hAnsi="Times New Roman" w:cs="Times New Roman" w:eastAsia="Times New Roman"/>
-                <w:sz w:val="20"/>
-                <w:szCs w:val="20"/>
-              </w:rPr>
-              <w:t xml:space="preserve">1995</w:t>
-            </w:r>
-          </w:p>
-        </w:tc>
-        <w:tc>
-          <w:tcPr/>
-          <w:p>
-            <w:pPr>
-              <w:pStyle w:val="Normal"/>
-              <w:jc w:val="left"/>
-              <w:spacing w:line="240" w:lineRule="auto" w:after="0"/>
-            </w:pPr>
-            <w:r>
-              <w:rPr>
-                <w:rFonts w:ascii="Times New Roman" w:hAnsi="Times New Roman" w:cs="Times New Roman" w:eastAsia="Times New Roman"/>
-                <w:sz w:val="20"/>
-                <w:szCs w:val="20"/>
-              </w:rPr>
-              <w:t xml:space="preserve">Thrombolysis</w:t>
-            </w:r>
-          </w:p>
-        </w:tc>
-        <w:tc>
-          <w:tcPr/>
-          <w:p>
-            <w:pPr>
-              <w:pStyle w:val="Normal"/>
-              <w:jc w:val="left"/>
-              <w:spacing w:line="240" w:lineRule="auto" w:after="0"/>
-            </w:pPr>
-            <w:r>
-              <w:rPr>
-                <w:rFonts w:ascii="Times New Roman" w:hAnsi="Times New Roman" w:cs="Times New Roman" w:eastAsia="Times New Roman"/>
-                <w:sz w:val="20"/>
-                <w:szCs w:val="20"/>
-              </w:rPr>
-              <w:t xml:space="preserve">2216</w:t>
-            </w:r>
-          </w:p>
-        </w:tc>
-        <w:tc>
-          <w:tcPr/>
-          <w:p>
-            <w:pPr>
-              <w:pStyle w:val="Normal"/>
-              <w:jc w:val="left"/>
-              <w:spacing w:line="240" w:lineRule="auto" w:after="0"/>
-            </w:pPr>
-            <w:r>
-              <w:rPr>
-                <w:rFonts w:ascii="Times New Roman" w:hAnsi="Times New Roman" w:cs="Times New Roman" w:eastAsia="Times New Roman"/>
-                <w:sz w:val="20"/>
-                <w:szCs w:val="20"/>
-              </w:rPr>
-              <w:t xml:space="preserve">29,011</w:t>
-            </w:r>
-          </w:p>
-        </w:tc>
-        <w:tc>
-          <w:tcPr/>
-          <w:p>
-            <w:pPr>
-              <w:pStyle w:val="Normal"/>
-              <w:jc w:val="left"/>
-              <w:spacing w:line="240" w:lineRule="auto" w:after="0"/>
-            </w:pPr>
-            <w:r>
-              <w:rPr>
-                <w:rFonts w:ascii="Times New Roman" w:hAnsi="Times New Roman" w:cs="Times New Roman" w:eastAsia="Times New Roman"/>
-                <w:sz w:val="20"/>
-                <w:szCs w:val="20"/>
-              </w:rPr>
-              <w:t xml:space="preserve">2103</w:t>
-            </w:r>
-          </w:p>
-        </w:tc>
-        <w:tc>
-          <w:tcPr/>
-          <w:p>
-            <w:pPr>
-              <w:pStyle w:val="Normal"/>
-              <w:jc w:val="left"/>
-              <w:spacing w:line="240" w:lineRule="auto" w:after="0"/>
-            </w:pPr>
-            <w:r>
-              <w:rPr>
-                <w:rFonts w:ascii="Times New Roman" w:hAnsi="Times New Roman" w:cs="Times New Roman" w:eastAsia="Times New Roman"/>
-                <w:sz w:val="20"/>
-                <w:szCs w:val="20"/>
-              </w:rPr>
-              <w:t xml:space="preserve">29,039</w:t>
-            </w:r>
-          </w:p>
-        </w:tc>
-        <w:tc>
-          <w:tcPr/>
-          <w:p>
-            <w:pPr>
-              <w:pStyle w:val="Normal"/>
-              <w:jc w:val="left"/>
-              <w:spacing w:line="240" w:lineRule="auto" w:after="0"/>
-            </w:pPr>
-            <w:r>
-              <w:rPr>
-                <w:rFonts w:ascii="Times New Roman" w:hAnsi="Times New Roman" w:cs="Times New Roman" w:eastAsia="Times New Roman"/>
-                <w:sz w:val="20"/>
-                <w:szCs w:val="20"/>
-              </w:rPr>
-              <w:t xml:space="preserve">7.2%</w:t>
-            </w:r>
-          </w:p>
-        </w:tc>
-      </w:tr>
-    </w:tbl>
-    <w:tbl xmlns:a="http://schemas.openxmlformats.org/drawingml/2006/main" xmlns:pic="http://schemas.openxmlformats.org/drawingml/2006/picture">
-      <w:tblPr>
-        <w:tblStyle w:val="Table Grid"/>
-        <w:tblW w:type="auto" w:w="0"/>
-        <w:tblLook w:firstRow="1" w:lastRow="0" w:firstColumn="0" w:lastColumn="0" w:noHBand="0" w:noVBand="0" w:val="0020"/>
-        <w:jc w:val="center"/>
-      </w:tblPr>
-      <w:tblGrid>
-        <w:gridCol w:w="1584"/>
-        <w:gridCol w:w="1584"/>
-        <w:gridCol w:w="1584"/>
-        <w:gridCol w:w="1584"/>
-        <w:gridCol w:w="1584"/>
-      </w:tblGrid>
-      <w:tr>
-        <w:trPr>
-          <w:tblHeader w:val="true"/>
-        </w:trPr>
-        <w:tc>
-          <w:tcPr/>
-          <w:p>
-            <w:pPr>
-              <w:pStyle w:val="Normal"/>
-              <w:jc w:val="left"/>
-              <w:spacing w:line="240" w:lineRule="auto" w:after="0"/>
-            </w:pPr>
-            <w:r>
-              <w:rPr>
-                <w:rFonts w:ascii="Times New Roman" w:hAnsi="Times New Roman" w:cs="Times New Roman" w:eastAsia="Times New Roman"/>
-                <w:sz w:val="20"/>
-                <w:szCs w:val="20"/>
-                <w:b/>
-              </w:rPr>
-              <w:t xml:space="preserve">Study</w:t>
-            </w:r>
-          </w:p>
-        </w:tc>
-        <w:tc>
-          <w:tcPr/>
-          <w:p>
-            <w:pPr>
-              <w:pStyle w:val="Normal"/>
-              <w:jc w:val="left"/>
-              <w:spacing w:line="240" w:lineRule="auto" w:after="0"/>
-            </w:pPr>
-            <w:r>
-              <w:rPr>
-                <w:rFonts w:ascii="Times New Roman" w:hAnsi="Times New Roman" w:cs="Times New Roman" w:eastAsia="Times New Roman"/>
-                <w:sz w:val="20"/>
-                <w:szCs w:val="20"/>
-                <w:b/>
-              </w:rPr>
-              <w:t xml:space="preserve">Design</w:t>
-            </w:r>
-          </w:p>
-        </w:tc>
-        <w:tc>
-          <w:tcPr/>
-          <w:p>
-            <w:pPr>
-              <w:pStyle w:val="Normal"/>
-              <w:jc w:val="left"/>
-              <w:spacing w:line="240" w:lineRule="auto" w:after="0"/>
-            </w:pPr>
-            <w:r>
-              <w:rPr>
-                <w:rFonts w:ascii="Times New Roman" w:hAnsi="Times New Roman" w:cs="Times New Roman" w:eastAsia="Times New Roman"/>
-                <w:sz w:val="20"/>
-                <w:szCs w:val="20"/>
-                <w:b/>
-              </w:rPr>
-              <w:t xml:space="preserve">HR (95% CI)</w:t>
-            </w:r>
-          </w:p>
-        </w:tc>
-        <w:tc>
-          <w:tcPr/>
-          <w:p>
-            <w:pPr>
-              <w:pStyle w:val="Normal"/>
-              <w:jc w:val="left"/>
-              <w:spacing w:line="240" w:lineRule="auto" w:after="0"/>
-            </w:pPr>
-            <w:r>
-              <w:rPr>
-                <w:rFonts w:ascii="Times New Roman" w:hAnsi="Times New Roman" w:cs="Times New Roman" w:eastAsia="Times New Roman"/>
-                <w:sz w:val="20"/>
-                <w:szCs w:val="20"/>
-                <w:b/>
-              </w:rPr>
-              <w:t xml:space="preserve">N</w:t>
-            </w:r>
-          </w:p>
-        </w:tc>
-        <w:tc>
-          <w:tcPr/>
-          <w:p>
-            <w:pPr>
-              <w:pStyle w:val="Normal"/>
-              <w:jc w:val="left"/>
-              <w:spacing w:line="240" w:lineRule="auto" w:after="0"/>
-            </w:pPr>
-            <w:r>
-              <w:rPr>
-                <w:rFonts w:ascii="Times New Roman" w:hAnsi="Times New Roman" w:cs="Times New Roman" w:eastAsia="Times New Roman"/>
-                <w:sz w:val="20"/>
-                <w:szCs w:val="20"/>
-                <w:b/>
-              </w:rPr>
-              <w:t xml:space="preserve">Events</w:t>
-            </w:r>
-          </w:p>
-        </w:tc>
-      </w:tr>
-      <w:tr>
-        <w:tc>
-          <w:tcPr/>
-          <w:p>
-            <w:pPr>
-              <w:pStyle w:val="Normal"/>
-              <w:jc w:val="left"/>
-              <w:spacing w:line="240" w:lineRule="auto" w:after="0"/>
-            </w:pPr>
-            <w:r>
-              <w:rPr>
-                <w:rFonts w:ascii="Times New Roman" w:hAnsi="Times New Roman" w:cs="Times New Roman" w:eastAsia="Times New Roman"/>
-                <w:sz w:val="20"/>
-                <w:szCs w:val="20"/>
-              </w:rPr>
-              <w:t xml:space="preserve">Mozaffarian 2004</w:t>
-            </w:r>
-          </w:p>
-        </w:tc>
-        <w:tc>
-          <w:tcPr/>
-          <w:p>
-            <w:pPr>
-              <w:pStyle w:val="Normal"/>
-              <w:jc w:val="left"/>
-              <w:spacing w:line="240" w:lineRule="auto" w:after="0"/>
-            </w:pPr>
-            <w:r>
-              <w:rPr>
-                <w:rFonts w:ascii="Times New Roman" w:hAnsi="Times New Roman" w:cs="Times New Roman" w:eastAsia="Times New Roman"/>
-                <w:sz w:val="20"/>
-                <w:szCs w:val="20"/>
-              </w:rPr>
-              <w:t xml:space="preserve">OBS</w:t>
-            </w:r>
-          </w:p>
-        </w:tc>
-        <w:tc>
-          <w:tcPr/>
-          <w:p>
-            <w:pPr>
-              <w:pStyle w:val="Normal"/>
-              <w:jc w:val="left"/>
-              <w:spacing w:line="240" w:lineRule="auto" w:after="0"/>
-            </w:pPr>
-            <w:r>
-              <w:rPr>
-                <w:rFonts w:ascii="Times New Roman" w:hAnsi="Times New Roman" w:cs="Times New Roman" w:eastAsia="Times New Roman"/>
-                <w:sz w:val="20"/>
-                <w:szCs w:val="20"/>
-              </w:rPr>
-              <w:t xml:space="preserve">0.62 (0.49–0.78)</w:t>
-            </w:r>
-          </w:p>
-        </w:tc>
-        <w:tc>
-          <w:tcPr/>
-          <w:p>
-            <w:pPr>
-              <w:pStyle w:val="Normal"/>
-              <w:jc w:val="left"/>
-              <w:spacing w:line="240" w:lineRule="auto" w:after="0"/>
-            </w:pPr>
-            <w:r>
-              <w:rPr>
-                <w:rFonts w:ascii="Times New Roman" w:hAnsi="Times New Roman" w:cs="Times New Roman" w:eastAsia="Times New Roman"/>
-                <w:sz w:val="20"/>
-                <w:szCs w:val="20"/>
-              </w:rPr>
-              <w:t xml:space="preserve">1,153</w:t>
-            </w:r>
-          </w:p>
-        </w:tc>
-        <w:tc>
-          <w:tcPr/>
-          <w:p>
-            <w:pPr>
-              <w:pStyle w:val="Normal"/>
-              <w:jc w:val="left"/>
-              <w:spacing w:line="240" w:lineRule="auto" w:after="0"/>
-            </w:pPr>
-            <w:r>
-              <w:rPr>
-                <w:rFonts w:ascii="Times New Roman" w:hAnsi="Times New Roman" w:cs="Times New Roman" w:eastAsia="Times New Roman"/>
-                <w:sz w:val="20"/>
-                <w:szCs w:val="20"/>
-              </w:rPr>
-              <w:t xml:space="preserve">356</w:t>
-            </w:r>
-          </w:p>
-        </w:tc>
-      </w:tr>
-      <w:tr>
-        <w:tc>
-          <w:tcPr/>
-          <w:p>
-            <w:pPr>
-              <w:pStyle w:val="Normal"/>
-              <w:jc w:val="left"/>
-              <w:spacing w:line="240" w:lineRule="auto" w:after="0"/>
-            </w:pPr>
-            <w:r>
-              <w:rPr>
-                <w:rFonts w:ascii="Times New Roman" w:hAnsi="Times New Roman" w:cs="Times New Roman" w:eastAsia="Times New Roman"/>
-                <w:sz w:val="20"/>
-                <w:szCs w:val="20"/>
-              </w:rPr>
-              <w:t xml:space="preserve">Horwich 2004</w:t>
-            </w:r>
-          </w:p>
-        </w:tc>
-        <w:tc>
-          <w:tcPr/>
-          <w:p>
-            <w:pPr>
-              <w:pStyle w:val="Normal"/>
-              <w:jc w:val="left"/>
-              <w:spacing w:line="240" w:lineRule="auto" w:after="0"/>
-            </w:pPr>
-            <w:r>
-              <w:rPr>
-                <w:rFonts w:ascii="Times New Roman" w:hAnsi="Times New Roman" w:cs="Times New Roman" w:eastAsia="Times New Roman"/>
-                <w:sz w:val="20"/>
-                <w:szCs w:val="20"/>
-              </w:rPr>
-              <w:t xml:space="preserve">OBS</w:t>
-            </w:r>
-          </w:p>
-        </w:tc>
-        <w:tc>
-          <w:tcPr/>
-          <w:p>
-            <w:pPr>
-              <w:pStyle w:val="Normal"/>
-              <w:jc w:val="left"/>
-              <w:spacing w:line="240" w:lineRule="auto" w:after="0"/>
-            </w:pPr>
-            <w:r>
-              <w:rPr>
-                <w:rFonts w:ascii="Times New Roman" w:hAnsi="Times New Roman" w:cs="Times New Roman" w:eastAsia="Times New Roman"/>
-                <w:sz w:val="20"/>
-                <w:szCs w:val="20"/>
-              </w:rPr>
-              <w:t xml:space="preserve">0.59 (0.44–0.78)</w:t>
-            </w:r>
-          </w:p>
-        </w:tc>
-        <w:tc>
-          <w:tcPr/>
-          <w:p>
-            <w:pPr>
-              <w:pStyle w:val="Normal"/>
-              <w:jc w:val="left"/>
-              <w:spacing w:line="240" w:lineRule="auto" w:after="0"/>
-            </w:pPr>
-            <w:r>
-              <w:rPr>
-                <w:rFonts w:ascii="Times New Roman" w:hAnsi="Times New Roman" w:cs="Times New Roman" w:eastAsia="Times New Roman"/>
-                <w:sz w:val="20"/>
-                <w:szCs w:val="20"/>
-              </w:rPr>
-              <w:t xml:space="preserve">551</w:t>
-            </w:r>
-          </w:p>
-        </w:tc>
-        <w:tc>
-          <w:tcPr/>
-          <w:p>
-            <w:pPr>
-              <w:pStyle w:val="Normal"/>
-              <w:jc w:val="left"/>
-              <w:spacing w:line="240" w:lineRule="auto" w:after="0"/>
-            </w:pPr>
-            <w:r>
-              <w:rPr>
-                <w:rFonts w:ascii="Times New Roman" w:hAnsi="Times New Roman" w:cs="Times New Roman" w:eastAsia="Times New Roman"/>
-                <w:sz w:val="20"/>
-                <w:szCs w:val="20"/>
-              </w:rPr>
-              <w:t xml:space="preserve">189</w:t>
-            </w:r>
-          </w:p>
-        </w:tc>
-      </w:tr>
-      <w:tr>
-        <w:tc>
-          <w:tcPr/>
-          <w:p>
-            <w:pPr>
-              <w:pStyle w:val="Normal"/>
-              <w:jc w:val="left"/>
-              <w:spacing w:line="240" w:lineRule="auto" w:after="0"/>
-            </w:pPr>
-            <w:r>
-              <w:rPr>
-                <w:rFonts w:ascii="Times New Roman" w:hAnsi="Times New Roman" w:cs="Times New Roman" w:eastAsia="Times New Roman"/>
-                <w:sz w:val="20"/>
-                <w:szCs w:val="20"/>
-              </w:rPr>
-              <w:t xml:space="preserve">Go 2006</w:t>
-            </w:r>
-          </w:p>
-        </w:tc>
-        <w:tc>
-          <w:tcPr/>
-          <w:p>
-            <w:pPr>
-              <w:pStyle w:val="Normal"/>
-              <w:jc w:val="left"/>
-              <w:spacing w:line="240" w:lineRule="auto" w:after="0"/>
-            </w:pPr>
-            <w:r>
-              <w:rPr>
-                <w:rFonts w:ascii="Times New Roman" w:hAnsi="Times New Roman" w:cs="Times New Roman" w:eastAsia="Times New Roman"/>
-                <w:sz w:val="20"/>
-                <w:szCs w:val="20"/>
-              </w:rPr>
-              <w:t xml:space="preserve">OBS</w:t>
-            </w:r>
-          </w:p>
-        </w:tc>
-        <w:tc>
-          <w:tcPr/>
-          <w:p>
-            <w:pPr>
-              <w:pStyle w:val="Normal"/>
-              <w:jc w:val="left"/>
-              <w:spacing w:line="240" w:lineRule="auto" w:after="0"/>
-            </w:pPr>
-            <w:r>
-              <w:rPr>
-                <w:rFonts w:ascii="Times New Roman" w:hAnsi="Times New Roman" w:cs="Times New Roman" w:eastAsia="Times New Roman"/>
-                <w:sz w:val="20"/>
-                <w:szCs w:val="20"/>
-              </w:rPr>
-              <w:t xml:space="preserve">0.69 (0.63–0.75)</w:t>
-            </w:r>
-          </w:p>
-        </w:tc>
-        <w:tc>
-          <w:tcPr/>
-          <w:p>
-            <w:pPr>
-              <w:pStyle w:val="Normal"/>
-              <w:jc w:val="left"/>
-              <w:spacing w:line="240" w:lineRule="auto" w:after="0"/>
-            </w:pPr>
-            <w:r>
-              <w:rPr>
-                <w:rFonts w:ascii="Times New Roman" w:hAnsi="Times New Roman" w:cs="Times New Roman" w:eastAsia="Times New Roman"/>
-                <w:sz w:val="20"/>
-                <w:szCs w:val="20"/>
-              </w:rPr>
-              <w:t xml:space="preserve">24,598</w:t>
-            </w:r>
-          </w:p>
-        </w:tc>
-        <w:tc>
-          <w:tcPr/>
-          <w:p>
-            <w:pPr>
-              <w:pStyle w:val="Normal"/>
-              <w:jc w:val="left"/>
-              <w:spacing w:line="240" w:lineRule="auto" w:after="0"/>
-            </w:pPr>
-            <w:r>
-              <w:rPr>
-                <w:rFonts w:ascii="Times New Roman" w:hAnsi="Times New Roman" w:cs="Times New Roman" w:eastAsia="Times New Roman"/>
-                <w:sz w:val="20"/>
-                <w:szCs w:val="20"/>
-              </w:rPr>
-              <w:t xml:space="preserve">5,765</w:t>
-            </w:r>
-          </w:p>
-        </w:tc>
-      </w:tr>
-      <w:tr>
-        <w:tc>
-          <w:tcPr/>
-          <w:p>
-            <w:pPr>
-              <w:pStyle w:val="Normal"/>
-              <w:jc w:val="left"/>
-              <w:spacing w:line="240" w:lineRule="auto" w:after="0"/>
-            </w:pPr>
-            <w:r>
-              <w:rPr>
-                <w:rFonts w:ascii="Times New Roman" w:hAnsi="Times New Roman" w:cs="Times New Roman" w:eastAsia="Times New Roman"/>
-                <w:sz w:val="20"/>
-                <w:szCs w:val="20"/>
-              </w:rPr>
-              <w:t xml:space="preserve">Foody 2006</w:t>
-            </w:r>
-          </w:p>
-        </w:tc>
-        <w:tc>
-          <w:tcPr/>
-          <w:p>
-            <w:pPr>
-              <w:pStyle w:val="Normal"/>
-              <w:jc w:val="left"/>
-              <w:spacing w:line="240" w:lineRule="auto" w:after="0"/>
-            </w:pPr>
-            <w:r>
-              <w:rPr>
-                <w:rFonts w:ascii="Times New Roman" w:hAnsi="Times New Roman" w:cs="Times New Roman" w:eastAsia="Times New Roman"/>
-                <w:sz w:val="20"/>
-                <w:szCs w:val="20"/>
-              </w:rPr>
-              <w:t xml:space="preserve">OBS</w:t>
-            </w:r>
-          </w:p>
-        </w:tc>
-        <w:tc>
-          <w:tcPr/>
-          <w:p>
-            <w:pPr>
-              <w:pStyle w:val="Normal"/>
-              <w:jc w:val="left"/>
-              <w:spacing w:line="240" w:lineRule="auto" w:after="0"/>
-            </w:pPr>
-            <w:r>
-              <w:rPr>
-                <w:rFonts w:ascii="Times New Roman" w:hAnsi="Times New Roman" w:cs="Times New Roman" w:eastAsia="Times New Roman"/>
-                <w:sz w:val="20"/>
-                <w:szCs w:val="20"/>
-              </w:rPr>
-              <w:t xml:space="preserve">0.82 (0.79–0.85)</w:t>
-            </w:r>
-          </w:p>
-        </w:tc>
-        <w:tc>
-          <w:tcPr/>
-          <w:p>
-            <w:pPr>
-              <w:pStyle w:val="Normal"/>
-              <w:jc w:val="left"/>
-              <w:spacing w:line="240" w:lineRule="auto" w:after="0"/>
-            </w:pPr>
-            <w:r>
-              <w:rPr>
-                <w:rFonts w:ascii="Times New Roman" w:hAnsi="Times New Roman" w:cs="Times New Roman" w:eastAsia="Times New Roman"/>
-                <w:sz w:val="20"/>
-                <w:szCs w:val="20"/>
-              </w:rPr>
-              <w:t xml:space="preserve">54,960</w:t>
-            </w:r>
-          </w:p>
-        </w:tc>
-        <w:tc>
-          <w:tcPr/>
-          <w:p>
-            <w:pPr>
-              <w:pStyle w:val="Normal"/>
-              <w:jc w:val="left"/>
-              <w:spacing w:line="240" w:lineRule="auto" w:after="0"/>
-            </w:pPr>
-            <w:r>
-              <w:rPr>
-                <w:rFonts w:ascii="Times New Roman" w:hAnsi="Times New Roman" w:cs="Times New Roman" w:eastAsia="Times New Roman"/>
-                <w:sz w:val="20"/>
-                <w:szCs w:val="20"/>
-              </w:rPr>
-              <w:t xml:space="preserve">16,573</w:t>
-            </w:r>
-          </w:p>
-        </w:tc>
-      </w:tr>
-      <w:tr>
-        <w:tc>
-          <w:tcPr/>
-          <w:p>
-            <w:pPr>
-              <w:pStyle w:val="Normal"/>
-              <w:jc w:val="left"/>
-              <w:spacing w:line="240" w:lineRule="auto" w:after="0"/>
-            </w:pPr>
-            <w:r>
-              <w:rPr>
-                <w:rFonts w:ascii="Times New Roman" w:hAnsi="Times New Roman" w:cs="Times New Roman" w:eastAsia="Times New Roman"/>
-                <w:sz w:val="20"/>
-                <w:szCs w:val="20"/>
-              </w:rPr>
-              <w:t xml:space="preserve">Anker 2006</w:t>
-            </w:r>
-          </w:p>
-        </w:tc>
-        <w:tc>
-          <w:tcPr/>
-          <w:p>
-            <w:pPr>
-              <w:pStyle w:val="Normal"/>
-              <w:jc w:val="left"/>
-              <w:spacing w:line="240" w:lineRule="auto" w:after="0"/>
-            </w:pPr>
-            <w:r>
-              <w:rPr>
-                <w:rFonts w:ascii="Times New Roman" w:hAnsi="Times New Roman" w:cs="Times New Roman" w:eastAsia="Times New Roman"/>
-                <w:sz w:val="20"/>
-                <w:szCs w:val="20"/>
-              </w:rPr>
-              <w:t xml:space="preserve">OBS</w:t>
-            </w:r>
-          </w:p>
-        </w:tc>
-        <w:tc>
-          <w:tcPr/>
-          <w:p>
-            <w:pPr>
-              <w:pStyle w:val="Normal"/>
-              <w:jc w:val="left"/>
-              <w:spacing w:line="240" w:lineRule="auto" w:after="0"/>
-            </w:pPr>
-            <w:r>
-              <w:rPr>
-                <w:rFonts w:ascii="Times New Roman" w:hAnsi="Times New Roman" w:cs="Times New Roman" w:eastAsia="Times New Roman"/>
-                <w:sz w:val="20"/>
-                <w:szCs w:val="20"/>
-              </w:rPr>
-              <w:t xml:space="preserve">0.75 (0.66–0.85)</w:t>
-            </w:r>
-          </w:p>
-        </w:tc>
-        <w:tc>
-          <w:tcPr/>
-          <w:p>
-            <w:pPr>
-              <w:pStyle w:val="Normal"/>
-              <w:jc w:val="left"/>
-              <w:spacing w:line="240" w:lineRule="auto" w:after="0"/>
-            </w:pPr>
-            <w:r>
-              <w:rPr>
-                <w:rFonts w:ascii="Times New Roman" w:hAnsi="Times New Roman" w:cs="Times New Roman" w:eastAsia="Times New Roman"/>
-                <w:sz w:val="20"/>
-                <w:szCs w:val="20"/>
-              </w:rPr>
-              <w:t xml:space="preserve">10,510</w:t>
-            </w:r>
-          </w:p>
-        </w:tc>
-        <w:tc>
-          <w:tcPr/>
-          <w:p>
-            <w:pPr>
-              <w:pStyle w:val="Normal"/>
-              <w:jc w:val="left"/>
-              <w:spacing w:line="240" w:lineRule="auto" w:after="0"/>
-            </w:pPr>
-            <w:r>
-              <w:rPr>
-                <w:rFonts w:ascii="Times New Roman" w:hAnsi="Times New Roman" w:cs="Times New Roman" w:eastAsia="Times New Roman"/>
-                <w:sz w:val="20"/>
-                <w:szCs w:val="20"/>
-              </w:rPr>
-              <w:t xml:space="preserve">2,890</w:t>
-            </w:r>
-          </w:p>
-        </w:tc>
-      </w:tr>
-      <w:tr>
-        <w:tc>
-          <w:tcPr/>
-          <w:p>
-            <w:pPr>
-              <w:pStyle w:val="Normal"/>
-              <w:jc w:val="left"/>
-              <w:spacing w:line="240" w:lineRule="auto" w:after="0"/>
-            </w:pPr>
-            <w:r>
-              <w:rPr>
-                <w:rFonts w:ascii="Times New Roman" w:hAnsi="Times New Roman" w:cs="Times New Roman" w:eastAsia="Times New Roman"/>
-                <w:sz w:val="20"/>
-                <w:szCs w:val="20"/>
-              </w:rPr>
-              <w:t xml:space="preserve">CORONA 2007</w:t>
-            </w:r>
-          </w:p>
-        </w:tc>
-        <w:tc>
-          <w:tcPr/>
-          <w:p>
-            <w:pPr>
-              <w:pStyle w:val="Normal"/>
-              <w:jc w:val="left"/>
-              <w:spacing w:line="240" w:lineRule="auto" w:after="0"/>
-            </w:pPr>
-            <w:r>
-              <w:rPr>
-                <w:rFonts w:ascii="Times New Roman" w:hAnsi="Times New Roman" w:cs="Times New Roman" w:eastAsia="Times New Roman"/>
-                <w:sz w:val="20"/>
-                <w:szCs w:val="20"/>
-              </w:rPr>
-              <w:t xml:space="preserve">RCT</w:t>
-            </w:r>
-          </w:p>
-        </w:tc>
-        <w:tc>
-          <w:tcPr/>
-          <w:p>
-            <w:pPr>
-              <w:pStyle w:val="Normal"/>
-              <w:jc w:val="left"/>
-              <w:spacing w:line="240" w:lineRule="auto" w:after="0"/>
-            </w:pPr>
-            <w:r>
-              <w:rPr>
-                <w:rFonts w:ascii="Times New Roman" w:hAnsi="Times New Roman" w:cs="Times New Roman" w:eastAsia="Times New Roman"/>
-                <w:sz w:val="20"/>
-                <w:szCs w:val="20"/>
-              </w:rPr>
-              <w:t xml:space="preserve">0.95 (0.86–1.05)</w:t>
-            </w:r>
-          </w:p>
-        </w:tc>
-        <w:tc>
-          <w:tcPr/>
-          <w:p>
-            <w:pPr>
-              <w:pStyle w:val="Normal"/>
-              <w:jc w:val="left"/>
-              <w:spacing w:line="240" w:lineRule="auto" w:after="0"/>
-            </w:pPr>
-            <w:r>
-              <w:rPr>
-                <w:rFonts w:ascii="Times New Roman" w:hAnsi="Times New Roman" w:cs="Times New Roman" w:eastAsia="Times New Roman"/>
-                <w:sz w:val="20"/>
-                <w:szCs w:val="20"/>
-              </w:rPr>
-              <w:t xml:space="preserve">5,011</w:t>
-            </w:r>
-          </w:p>
-        </w:tc>
-        <w:tc>
-          <w:tcPr/>
-          <w:p>
-            <w:pPr>
-              <w:pStyle w:val="Normal"/>
-              <w:jc w:val="left"/>
-              <w:spacing w:line="240" w:lineRule="auto" w:after="0"/>
-            </w:pPr>
-            <w:r>
-              <w:rPr>
-                <w:rFonts w:ascii="Times New Roman" w:hAnsi="Times New Roman" w:cs="Times New Roman" w:eastAsia="Times New Roman"/>
-                <w:sz w:val="20"/>
-                <w:szCs w:val="20"/>
-              </w:rPr>
-              <w:t xml:space="preserve">728</w:t>
-            </w:r>
-          </w:p>
-        </w:tc>
-      </w:tr>
-      <w:tr>
-        <w:tc>
-          <w:tcPr/>
-          <w:p>
-            <w:pPr>
-              <w:pStyle w:val="Normal"/>
-              <w:jc w:val="left"/>
-              <w:spacing w:line="240" w:lineRule="auto" w:after="0"/>
-            </w:pPr>
-            <w:r>
-              <w:rPr>
-                <w:rFonts w:ascii="Times New Roman" w:hAnsi="Times New Roman" w:cs="Times New Roman" w:eastAsia="Times New Roman"/>
-                <w:sz w:val="20"/>
-                <w:szCs w:val="20"/>
-              </w:rPr>
-              <w:t xml:space="preserve">GISSI-HF 2008</w:t>
-            </w:r>
-          </w:p>
-        </w:tc>
-        <w:tc>
-          <w:tcPr/>
-          <w:p>
-            <w:pPr>
-              <w:pStyle w:val="Normal"/>
-              <w:jc w:val="left"/>
-              <w:spacing w:line="240" w:lineRule="auto" w:after="0"/>
-            </w:pPr>
-            <w:r>
-              <w:rPr>
-                <w:rFonts w:ascii="Times New Roman" w:hAnsi="Times New Roman" w:cs="Times New Roman" w:eastAsia="Times New Roman"/>
-                <w:sz w:val="20"/>
-                <w:szCs w:val="20"/>
-              </w:rPr>
-              <w:t xml:space="preserve">RCT</w:t>
-            </w:r>
-          </w:p>
-        </w:tc>
-        <w:tc>
-          <w:tcPr/>
-          <w:p>
-            <w:pPr>
-              <w:pStyle w:val="Normal"/>
-              <w:jc w:val="left"/>
-              <w:spacing w:line="240" w:lineRule="auto" w:after="0"/>
-            </w:pPr>
-            <w:r>
-              <w:rPr>
-                <w:rFonts w:ascii="Times New Roman" w:hAnsi="Times New Roman" w:cs="Times New Roman" w:eastAsia="Times New Roman"/>
-                <w:sz w:val="20"/>
-                <w:szCs w:val="20"/>
-              </w:rPr>
-              <w:t xml:space="preserve">1.00 (0.90–1.12)</w:t>
-            </w:r>
-          </w:p>
-        </w:tc>
-        <w:tc>
-          <w:tcPr/>
-          <w:p>
-            <w:pPr>
-              <w:pStyle w:val="Normal"/>
-              <w:jc w:val="left"/>
-              <w:spacing w:line="240" w:lineRule="auto" w:after="0"/>
-            </w:pPr>
-            <w:r>
-              <w:rPr>
-                <w:rFonts w:ascii="Times New Roman" w:hAnsi="Times New Roman" w:cs="Times New Roman" w:eastAsia="Times New Roman"/>
-                <w:sz w:val="20"/>
-                <w:szCs w:val="20"/>
-              </w:rPr>
-              <w:t xml:space="preserve">4,574</w:t>
-            </w:r>
-          </w:p>
-        </w:tc>
-        <w:tc>
-          <w:tcPr/>
-          <w:p>
-            <w:pPr>
-              <w:pStyle w:val="Normal"/>
-              <w:jc w:val="left"/>
-              <w:spacing w:line="240" w:lineRule="auto" w:after="0"/>
-            </w:pPr>
-            <w:r>
-              <w:rPr>
-                <w:rFonts w:ascii="Times New Roman" w:hAnsi="Times New Roman" w:cs="Times New Roman" w:eastAsia="Times New Roman"/>
-                <w:sz w:val="20"/>
-                <w:szCs w:val="20"/>
-              </w:rPr>
-              <w:t xml:space="preserve">657</w:t>
-            </w:r>
-          </w:p>
-        </w:tc>
-      </w:tr>
-    </w:tbl>
-    <w:tbl xmlns:a="http://schemas.openxmlformats.org/drawingml/2006/main" xmlns:pic="http://schemas.openxmlformats.org/drawingml/2006/picture">
-      <w:tblPr>
-        <w:tblStyle w:val="Table Grid"/>
-        <w:tblW w:type="auto" w:w="0"/>
-        <w:tblLook w:firstRow="1" w:lastRow="0" w:firstColumn="0" w:lastColumn="0" w:noHBand="0" w:noVBand="0" w:val="0020"/>
-        <w:jc w:val="center"/>
-      </w:tblPr>
-      <w:tblGrid>
-        <w:gridCol w:w="1584"/>
-        <w:gridCol w:w="1584"/>
-        <w:gridCol w:w="1584"/>
-        <w:gridCol w:w="1584"/>
-        <w:gridCol w:w="1584"/>
-      </w:tblGrid>
-      <w:tr>
-        <w:trPr>
-          <w:tblHeader w:val="true"/>
-        </w:trPr>
         <w:tc>
           <w:tcPr/>
           <w:p>
@@ -4165,7 +1499,7 @@
                 <w:szCs w:val="20"/>
                 <w:b/>
               </w:rPr>
-              <w:t xml:space="preserve">OR (95% CrI)</w:t>
+              <w:t xml:space="preserve">OR/HR (95% CrI)</w:t>
             </w:r>
           </w:p>
         </w:tc>
@@ -4184,7 +1518,7 @@
                 <w:szCs w:val="20"/>
                 <w:b/>
               </w:rPr>
-              <w:t xml:space="preserve">P(OR &lt; 1)</w:t>
+              <w:t xml:space="preserve">P(effect &lt; 1)</w:t>
             </w:r>
           </w:p>
         </w:tc>
@@ -4203,7 +1537,7 @@
                 <w:szCs w:val="20"/>
                 <w:b/>
               </w:rPr>
-              <w:t xml:space="preserve">P(OR &lt; 0.90)</w:t>
+              <w:t xml:space="preserve">P(effect &lt; 0.90)</w:t>
             </w:r>
           </w:p>
         </w:tc>
@@ -4222,7 +1556,7 @@
                 <w:szCs w:val="20"/>
                 <w:b/>
               </w:rPr>
-              <w:t xml:space="preserve">P(OR &lt; 0.80)</w:t>
+              <w:t xml:space="preserve">P(effect &lt; 0.80)</w:t>
             </w:r>
           </w:p>
         </w:tc>
@@ -4242,7 +1576,7 @@
                 <w:sz w:val="20"/>
                 <w:szCs w:val="20"/>
               </w:rPr>
-              <w:t xml:space="preserve">0.0 (ISIS-4 only)</w:t>
+              <w:t xml:space="preserve">Magnesium (OR)</w:t>
             </w:r>
           </w:p>
         </w:tc>
@@ -4260,7 +1594,25 @@
                 <w:sz w:val="20"/>
                 <w:szCs w:val="20"/>
               </w:rPr>
-              <w:t xml:space="preserve">1.05 (0.03–27.97)</w:t>
+              <w:t xml:space="preserve">0.0 (ISIS-4 / RCTs only)</w:t>
+            </w:r>
+          </w:p>
+        </w:tc>
+        <w:tc>
+          <w:tcPr/>
+          <w:p>
+            <w:pPr>
+              <w:pStyle w:val="Normal"/>
+              <w:jc w:val="left"/>
+              <w:spacing w:line="240" w:lineRule="auto" w:after="0"/>
+            </w:pPr>
+            <w:r>
+              <w:rPr>
+                <w:rFonts w:ascii="Times New Roman" w:hAnsi="Times New Roman" w:cs="Times New Roman" w:eastAsia="Times New Roman"/>
+                <w:sz w:val="20"/>
+                <w:szCs w:val="20"/>
+              </w:rPr>
+              <w:t xml:space="preserve">OR 1.05 (0.03–27.97)</w:t>
             </w:r>
           </w:p>
         </w:tc>
@@ -4334,6 +1686,134 @@
                 <w:sz w:val="20"/>
                 <w:szCs w:val="20"/>
               </w:rPr>
+              <w:t xml:space="preserve">Statins (HR)</w:t>
+            </w:r>
+          </w:p>
+        </w:tc>
+        <w:tc>
+          <w:tcPr/>
+          <w:p>
+            <w:pPr>
+              <w:pStyle w:val="Normal"/>
+              <w:jc w:val="left"/>
+              <w:spacing w:line="240" w:lineRule="auto" w:after="0"/>
+            </w:pPr>
+            <w:r>
+              <w:rPr>
+                <w:rFonts w:ascii="Times New Roman" w:hAnsi="Times New Roman" w:cs="Times New Roman" w:eastAsia="Times New Roman"/>
+                <w:sz w:val="20"/>
+                <w:szCs w:val="20"/>
+              </w:rPr>
+              <w:t xml:space="preserve">0.0 (ISIS-4 / RCTs only)</w:t>
+            </w:r>
+          </w:p>
+        </w:tc>
+        <w:tc>
+          <w:tcPr/>
+          <w:p>
+            <w:pPr>
+              <w:pStyle w:val="Normal"/>
+              <w:jc w:val="left"/>
+              <w:spacing w:line="240" w:lineRule="auto" w:after="0"/>
+            </w:pPr>
+            <w:r>
+              <w:rPr>
+                <w:rFonts w:ascii="Times New Roman" w:hAnsi="Times New Roman" w:cs="Times New Roman" w:eastAsia="Times New Roman"/>
+                <w:sz w:val="20"/>
+                <w:szCs w:val="20"/>
+              </w:rPr>
+              <w:t xml:space="preserve">HR 0.97 (0.58–1.65)</w:t>
+            </w:r>
+          </w:p>
+        </w:tc>
+        <w:tc>
+          <w:tcPr/>
+          <w:p>
+            <w:pPr>
+              <w:pStyle w:val="Normal"/>
+              <w:jc w:val="left"/>
+              <w:spacing w:line="240" w:lineRule="auto" w:after="0"/>
+            </w:pPr>
+            <w:r>
+              <w:rPr>
+                <w:rFonts w:ascii="Times New Roman" w:hAnsi="Times New Roman" w:cs="Times New Roman" w:eastAsia="Times New Roman"/>
+                <w:sz w:val="20"/>
+                <w:szCs w:val="20"/>
+              </w:rPr>
+              <w:t xml:space="preserve">62.9%</w:t>
+            </w:r>
+          </w:p>
+        </w:tc>
+        <w:tc>
+          <w:tcPr/>
+          <w:p>
+            <w:pPr>
+              <w:pStyle w:val="Normal"/>
+              <w:jc w:val="left"/>
+              <w:spacing w:line="240" w:lineRule="auto" w:after="0"/>
+            </w:pPr>
+            <w:r>
+              <w:rPr>
+                <w:rFonts w:ascii="Times New Roman" w:hAnsi="Times New Roman" w:cs="Times New Roman" w:eastAsia="Times New Roman"/>
+                <w:sz w:val="20"/>
+                <w:szCs w:val="20"/>
+              </w:rPr>
+              <w:t xml:space="preserve">21.2%</w:t>
+            </w:r>
+          </w:p>
+        </w:tc>
+        <w:tc>
+          <w:tcPr/>
+          <w:p>
+            <w:pPr>
+              <w:pStyle w:val="Normal"/>
+              <w:jc w:val="left"/>
+              <w:spacing w:line="240" w:lineRule="auto" w:after="0"/>
+            </w:pPr>
+            <w:r>
+              <w:rPr>
+                <w:rFonts w:ascii="Times New Roman" w:hAnsi="Times New Roman" w:cs="Times New Roman" w:eastAsia="Times New Roman"/>
+                <w:sz w:val="20"/>
+                <w:szCs w:val="20"/>
+              </w:rPr>
+              <w:t xml:space="preserve">8.9%</w:t>
+            </w:r>
+          </w:p>
+        </w:tc>
+      </w:tr>
+      <w:tr>
+        <w:tc>
+          <w:tcPr/>
+          <w:p>
+            <w:pPr>
+              <w:pStyle w:val="Normal"/>
+              <w:jc w:val="left"/>
+              <w:spacing w:line="240" w:lineRule="auto" w:after="0"/>
+            </w:pPr>
+            <w:r>
+              <w:rPr>
+                <w:rFonts w:ascii="Times New Roman" w:hAnsi="Times New Roman" w:cs="Times New Roman" w:eastAsia="Times New Roman"/>
+                <w:sz w:val="20"/>
+                <w:szCs w:val="20"/>
+              </w:rPr>
+              <w:t xml:space="preserve">Magnesium (OR)</w:t>
+            </w:r>
+          </w:p>
+        </w:tc>
+        <w:tc>
+          <w:tcPr/>
+          <w:p>
+            <w:pPr>
+              <w:pStyle w:val="Normal"/>
+              <w:jc w:val="left"/>
+              <w:spacing w:line="240" w:lineRule="auto" w:after="0"/>
+            </w:pPr>
+            <w:r>
+              <w:rPr>
+                <w:rFonts w:ascii="Times New Roman" w:hAnsi="Times New Roman" w:cs="Times New Roman" w:eastAsia="Times New Roman"/>
+                <w:sz w:val="20"/>
+                <w:szCs w:val="20"/>
+              </w:rPr>
               <w:t xml:space="preserve">0.1</w:t>
             </w:r>
           </w:p>
@@ -4352,7 +1832,7 @@
                 <w:sz w:val="20"/>
                 <w:szCs w:val="20"/>
               </w:rPr>
-              <w:t xml:space="preserve">0.93 (0.15–2.92)</w:t>
+              <w:t xml:space="preserve">OR 0.93 (0.15–2.92)</w:t>
             </w:r>
           </w:p>
         </w:tc>
@@ -4426,6 +1906,134 @@
                 <w:sz w:val="20"/>
                 <w:szCs w:val="20"/>
               </w:rPr>
+              <w:t xml:space="preserve">Statins (HR)</w:t>
+            </w:r>
+          </w:p>
+        </w:tc>
+        <w:tc>
+          <w:tcPr/>
+          <w:p>
+            <w:pPr>
+              <w:pStyle w:val="Normal"/>
+              <w:jc w:val="left"/>
+              <w:spacing w:line="240" w:lineRule="auto" w:after="0"/>
+            </w:pPr>
+            <w:r>
+              <w:rPr>
+                <w:rFonts w:ascii="Times New Roman" w:hAnsi="Times New Roman" w:cs="Times New Roman" w:eastAsia="Times New Roman"/>
+                <w:sz w:val="20"/>
+                <w:szCs w:val="20"/>
+              </w:rPr>
+              <w:t xml:space="preserve">0.1</w:t>
+            </w:r>
+          </w:p>
+        </w:tc>
+        <w:tc>
+          <w:tcPr/>
+          <w:p>
+            <w:pPr>
+              <w:pStyle w:val="Normal"/>
+              <w:jc w:val="left"/>
+              <w:spacing w:line="240" w:lineRule="auto" w:after="0"/>
+            </w:pPr>
+            <w:r>
+              <w:rPr>
+                <w:rFonts w:ascii="Times New Roman" w:hAnsi="Times New Roman" w:cs="Times New Roman" w:eastAsia="Times New Roman"/>
+                <w:sz w:val="20"/>
+                <w:szCs w:val="20"/>
+              </w:rPr>
+              <w:t xml:space="preserve">HR 0.92 (0.53–1.64)</w:t>
+            </w:r>
+          </w:p>
+        </w:tc>
+        <w:tc>
+          <w:tcPr/>
+          <w:p>
+            <w:pPr>
+              <w:pStyle w:val="Normal"/>
+              <w:jc w:val="left"/>
+              <w:spacing w:line="240" w:lineRule="auto" w:after="0"/>
+            </w:pPr>
+            <w:r>
+              <w:rPr>
+                <w:rFonts w:ascii="Times New Roman" w:hAnsi="Times New Roman" w:cs="Times New Roman" w:eastAsia="Times New Roman"/>
+                <w:sz w:val="20"/>
+                <w:szCs w:val="20"/>
+              </w:rPr>
+              <w:t xml:space="preserve">71.9%</w:t>
+            </w:r>
+          </w:p>
+        </w:tc>
+        <w:tc>
+          <w:tcPr/>
+          <w:p>
+            <w:pPr>
+              <w:pStyle w:val="Normal"/>
+              <w:jc w:val="left"/>
+              <w:spacing w:line="240" w:lineRule="auto" w:after="0"/>
+            </w:pPr>
+            <w:r>
+              <w:rPr>
+                <w:rFonts w:ascii="Times New Roman" w:hAnsi="Times New Roman" w:cs="Times New Roman" w:eastAsia="Times New Roman"/>
+                <w:sz w:val="20"/>
+                <w:szCs w:val="20"/>
+              </w:rPr>
+              <w:t xml:space="preserve">42.7%</w:t>
+            </w:r>
+          </w:p>
+        </w:tc>
+        <w:tc>
+          <w:tcPr/>
+          <w:p>
+            <w:pPr>
+              <w:pStyle w:val="Normal"/>
+              <w:jc w:val="left"/>
+              <w:spacing w:line="240" w:lineRule="auto" w:after="0"/>
+            </w:pPr>
+            <w:r>
+              <w:rPr>
+                <w:rFonts w:ascii="Times New Roman" w:hAnsi="Times New Roman" w:cs="Times New Roman" w:eastAsia="Times New Roman"/>
+                <w:sz w:val="20"/>
+                <w:szCs w:val="20"/>
+              </w:rPr>
+              <w:t xml:space="preserve">19.2%</w:t>
+            </w:r>
+          </w:p>
+        </w:tc>
+      </w:tr>
+      <w:tr>
+        <w:tc>
+          <w:tcPr/>
+          <w:p>
+            <w:pPr>
+              <w:pStyle w:val="Normal"/>
+              <w:jc w:val="left"/>
+              <w:spacing w:line="240" w:lineRule="auto" w:after="0"/>
+            </w:pPr>
+            <w:r>
+              <w:rPr>
+                <w:rFonts w:ascii="Times New Roman" w:hAnsi="Times New Roman" w:cs="Times New Roman" w:eastAsia="Times New Roman"/>
+                <w:sz w:val="20"/>
+                <w:szCs w:val="20"/>
+              </w:rPr>
+              <w:t xml:space="preserve">Magnesium (OR)</w:t>
+            </w:r>
+          </w:p>
+        </w:tc>
+        <w:tc>
+          <w:tcPr/>
+          <w:p>
+            <w:pPr>
+              <w:pStyle w:val="Normal"/>
+              <w:jc w:val="left"/>
+              <w:spacing w:line="240" w:lineRule="auto" w:after="0"/>
+            </w:pPr>
+            <w:r>
+              <w:rPr>
+                <w:rFonts w:ascii="Times New Roman" w:hAnsi="Times New Roman" w:cs="Times New Roman" w:eastAsia="Times New Roman"/>
+                <w:sz w:val="20"/>
+                <w:szCs w:val="20"/>
+              </w:rPr>
               <w:t xml:space="preserve">0.2</w:t>
             </w:r>
           </w:p>
@@ -4444,7 +2052,7 @@
                 <w:sz w:val="20"/>
                 <w:szCs w:val="20"/>
               </w:rPr>
-              <w:t xml:space="preserve">0.83 (0.22–1.75)</w:t>
+              <w:t xml:space="preserve">OR 0.83 (0.22–1.75)</w:t>
             </w:r>
           </w:p>
         </w:tc>
@@ -4518,6 +2126,134 @@
                 <w:sz w:val="20"/>
                 <w:szCs w:val="20"/>
               </w:rPr>
+              <w:t xml:space="preserve">Statins (HR)</w:t>
+            </w:r>
+          </w:p>
+        </w:tc>
+        <w:tc>
+          <w:tcPr/>
+          <w:p>
+            <w:pPr>
+              <w:pStyle w:val="Normal"/>
+              <w:jc w:val="left"/>
+              <w:spacing w:line="240" w:lineRule="auto" w:after="0"/>
+            </w:pPr>
+            <w:r>
+              <w:rPr>
+                <w:rFonts w:ascii="Times New Roman" w:hAnsi="Times New Roman" w:cs="Times New Roman" w:eastAsia="Times New Roman"/>
+                <w:sz w:val="20"/>
+                <w:szCs w:val="20"/>
+              </w:rPr>
+              <w:t xml:space="preserve">0.2</w:t>
+            </w:r>
+          </w:p>
+        </w:tc>
+        <w:tc>
+          <w:tcPr/>
+          <w:p>
+            <w:pPr>
+              <w:pStyle w:val="Normal"/>
+              <w:jc w:val="left"/>
+              <w:spacing w:line="240" w:lineRule="auto" w:after="0"/>
+            </w:pPr>
+            <w:r>
+              <w:rPr>
+                <w:rFonts w:ascii="Times New Roman" w:hAnsi="Times New Roman" w:cs="Times New Roman" w:eastAsia="Times New Roman"/>
+                <w:sz w:val="20"/>
+                <w:szCs w:val="20"/>
+              </w:rPr>
+              <w:t xml:space="preserve">HR 0.89 (0.53–1.41)</w:t>
+            </w:r>
+          </w:p>
+        </w:tc>
+        <w:tc>
+          <w:tcPr/>
+          <w:p>
+            <w:pPr>
+              <w:pStyle w:val="Normal"/>
+              <w:jc w:val="left"/>
+              <w:spacing w:line="240" w:lineRule="auto" w:after="0"/>
+            </w:pPr>
+            <w:r>
+              <w:rPr>
+                <w:rFonts w:ascii="Times New Roman" w:hAnsi="Times New Roman" w:cs="Times New Roman" w:eastAsia="Times New Roman"/>
+                <w:sz w:val="20"/>
+                <w:szCs w:val="20"/>
+              </w:rPr>
+              <w:t xml:space="preserve">79.8%</w:t>
+            </w:r>
+          </w:p>
+        </w:tc>
+        <w:tc>
+          <w:tcPr/>
+          <w:p>
+            <w:pPr>
+              <w:pStyle w:val="Normal"/>
+              <w:jc w:val="left"/>
+              <w:spacing w:line="240" w:lineRule="auto" w:after="0"/>
+            </w:pPr>
+            <w:r>
+              <w:rPr>
+                <w:rFonts w:ascii="Times New Roman" w:hAnsi="Times New Roman" w:cs="Times New Roman" w:eastAsia="Times New Roman"/>
+                <w:sz w:val="20"/>
+                <w:szCs w:val="20"/>
+              </w:rPr>
+              <w:t xml:space="preserve">54.7%</w:t>
+            </w:r>
+          </w:p>
+        </w:tc>
+        <w:tc>
+          <w:tcPr/>
+          <w:p>
+            <w:pPr>
+              <w:pStyle w:val="Normal"/>
+              <w:jc w:val="left"/>
+              <w:spacing w:line="240" w:lineRule="auto" w:after="0"/>
+            </w:pPr>
+            <w:r>
+              <w:rPr>
+                <w:rFonts w:ascii="Times New Roman" w:hAnsi="Times New Roman" w:cs="Times New Roman" w:eastAsia="Times New Roman"/>
+                <w:sz w:val="20"/>
+                <w:szCs w:val="20"/>
+              </w:rPr>
+              <w:t xml:space="preserve">24.4%</w:t>
+            </w:r>
+          </w:p>
+        </w:tc>
+      </w:tr>
+      <w:tr>
+        <w:tc>
+          <w:tcPr/>
+          <w:p>
+            <w:pPr>
+              <w:pStyle w:val="Normal"/>
+              <w:jc w:val="left"/>
+              <w:spacing w:line="240" w:lineRule="auto" w:after="0"/>
+            </w:pPr>
+            <w:r>
+              <w:rPr>
+                <w:rFonts w:ascii="Times New Roman" w:hAnsi="Times New Roman" w:cs="Times New Roman" w:eastAsia="Times New Roman"/>
+                <w:sz w:val="20"/>
+                <w:szCs w:val="20"/>
+              </w:rPr>
+              <w:t xml:space="preserve">Magnesium (OR)</w:t>
+            </w:r>
+          </w:p>
+        </w:tc>
+        <w:tc>
+          <w:tcPr/>
+          <w:p>
+            <w:pPr>
+              <w:pStyle w:val="Normal"/>
+              <w:jc w:val="left"/>
+              <w:spacing w:line="240" w:lineRule="auto" w:after="0"/>
+            </w:pPr>
+            <w:r>
+              <w:rPr>
+                <w:rFonts w:ascii="Times New Roman" w:hAnsi="Times New Roman" w:cs="Times New Roman" w:eastAsia="Times New Roman"/>
+                <w:sz w:val="20"/>
+                <w:szCs w:val="20"/>
+              </w:rPr>
               <w:t xml:space="preserve">0.3</w:t>
             </w:r>
           </w:p>
@@ -4536,7 +2272,7 @@
                 <w:sz w:val="20"/>
                 <w:szCs w:val="20"/>
               </w:rPr>
-              <w:t xml:space="preserve">0.74 (0.25–1.43)</w:t>
+              <w:t xml:space="preserve">OR 0.74 (0.25–1.43)</w:t>
             </w:r>
           </w:p>
         </w:tc>
@@ -4610,6 +2346,134 @@
                 <w:sz w:val="20"/>
                 <w:szCs w:val="20"/>
               </w:rPr>
+              <w:t xml:space="preserve">Statins (HR)</w:t>
+            </w:r>
+          </w:p>
+        </w:tc>
+        <w:tc>
+          <w:tcPr/>
+          <w:p>
+            <w:pPr>
+              <w:pStyle w:val="Normal"/>
+              <w:jc w:val="left"/>
+              <w:spacing w:line="240" w:lineRule="auto" w:after="0"/>
+            </w:pPr>
+            <w:r>
+              <w:rPr>
+                <w:rFonts w:ascii="Times New Roman" w:hAnsi="Times New Roman" w:cs="Times New Roman" w:eastAsia="Times New Roman"/>
+                <w:sz w:val="20"/>
+                <w:szCs w:val="20"/>
+              </w:rPr>
+              <w:t xml:space="preserve">0.3</w:t>
+            </w:r>
+          </w:p>
+        </w:tc>
+        <w:tc>
+          <w:tcPr/>
+          <w:p>
+            <w:pPr>
+              <w:pStyle w:val="Normal"/>
+              <w:jc w:val="left"/>
+              <w:spacing w:line="240" w:lineRule="auto" w:after="0"/>
+            </w:pPr>
+            <w:r>
+              <w:rPr>
+                <w:rFonts w:ascii="Times New Roman" w:hAnsi="Times New Roman" w:cs="Times New Roman" w:eastAsia="Times New Roman"/>
+                <w:sz w:val="20"/>
+                <w:szCs w:val="20"/>
+              </w:rPr>
+              <w:t xml:space="preserve">HR 0.85 (0.55–1.24)</w:t>
+            </w:r>
+          </w:p>
+        </w:tc>
+        <w:tc>
+          <w:tcPr/>
+          <w:p>
+            <w:pPr>
+              <w:pStyle w:val="Normal"/>
+              <w:jc w:val="left"/>
+              <w:spacing w:line="240" w:lineRule="auto" w:after="0"/>
+            </w:pPr>
+            <w:r>
+              <w:rPr>
+                <w:rFonts w:ascii="Times New Roman" w:hAnsi="Times New Roman" w:cs="Times New Roman" w:eastAsia="Times New Roman"/>
+                <w:sz w:val="20"/>
+                <w:szCs w:val="20"/>
+              </w:rPr>
+              <w:t xml:space="preserve">86.5%</w:t>
+            </w:r>
+          </w:p>
+        </w:tc>
+        <w:tc>
+          <w:tcPr/>
+          <w:p>
+            <w:pPr>
+              <w:pStyle w:val="Normal"/>
+              <w:jc w:val="left"/>
+              <w:spacing w:line="240" w:lineRule="auto" w:after="0"/>
+            </w:pPr>
+            <w:r>
+              <w:rPr>
+                <w:rFonts w:ascii="Times New Roman" w:hAnsi="Times New Roman" w:cs="Times New Roman" w:eastAsia="Times New Roman"/>
+                <w:sz w:val="20"/>
+                <w:szCs w:val="20"/>
+              </w:rPr>
+              <w:t xml:space="preserve">66.0%</w:t>
+            </w:r>
+          </w:p>
+        </w:tc>
+        <w:tc>
+          <w:tcPr/>
+          <w:p>
+            <w:pPr>
+              <w:pStyle w:val="Normal"/>
+              <w:jc w:val="left"/>
+              <w:spacing w:line="240" w:lineRule="auto" w:after="0"/>
+            </w:pPr>
+            <w:r>
+              <w:rPr>
+                <w:rFonts w:ascii="Times New Roman" w:hAnsi="Times New Roman" w:cs="Times New Roman" w:eastAsia="Times New Roman"/>
+                <w:sz w:val="20"/>
+                <w:szCs w:val="20"/>
+              </w:rPr>
+              <w:t xml:space="preserve">31.1%</w:t>
+            </w:r>
+          </w:p>
+        </w:tc>
+      </w:tr>
+      <w:tr>
+        <w:tc>
+          <w:tcPr/>
+          <w:p>
+            <w:pPr>
+              <w:pStyle w:val="Normal"/>
+              <w:jc w:val="left"/>
+              <w:spacing w:line="240" w:lineRule="auto" w:after="0"/>
+            </w:pPr>
+            <w:r>
+              <w:rPr>
+                <w:rFonts w:ascii="Times New Roman" w:hAnsi="Times New Roman" w:cs="Times New Roman" w:eastAsia="Times New Roman"/>
+                <w:sz w:val="20"/>
+                <w:szCs w:val="20"/>
+              </w:rPr>
+              <w:t xml:space="preserve">Magnesium (OR)</w:t>
+            </w:r>
+          </w:p>
+        </w:tc>
+        <w:tc>
+          <w:tcPr/>
+          <w:p>
+            <w:pPr>
+              <w:pStyle w:val="Normal"/>
+              <w:jc w:val="left"/>
+              <w:spacing w:line="240" w:lineRule="auto" w:after="0"/>
+            </w:pPr>
+            <w:r>
+              <w:rPr>
+                <w:rFonts w:ascii="Times New Roman" w:hAnsi="Times New Roman" w:cs="Times New Roman" w:eastAsia="Times New Roman"/>
+                <w:sz w:val="20"/>
+                <w:szCs w:val="20"/>
+              </w:rPr>
               <w:t xml:space="preserve">0.5</w:t>
             </w:r>
           </w:p>
@@ -4628,7 +2492,7 @@
                 <w:sz w:val="20"/>
                 <w:szCs w:val="20"/>
               </w:rPr>
-              <w:t xml:space="preserve">0.63 (0.28–1.10)</w:t>
+              <w:t xml:space="preserve">OR 0.63 (0.28–1.10)</w:t>
             </w:r>
           </w:p>
         </w:tc>
@@ -4702,6 +2566,134 @@
                 <w:sz w:val="20"/>
                 <w:szCs w:val="20"/>
               </w:rPr>
+              <w:t xml:space="preserve">Statins (HR)</w:t>
+            </w:r>
+          </w:p>
+        </w:tc>
+        <w:tc>
+          <w:tcPr/>
+          <w:p>
+            <w:pPr>
+              <w:pStyle w:val="Normal"/>
+              <w:jc w:val="left"/>
+              <w:spacing w:line="240" w:lineRule="auto" w:after="0"/>
+            </w:pPr>
+            <w:r>
+              <w:rPr>
+                <w:rFonts w:ascii="Times New Roman" w:hAnsi="Times New Roman" w:cs="Times New Roman" w:eastAsia="Times New Roman"/>
+                <w:sz w:val="20"/>
+                <w:szCs w:val="20"/>
+              </w:rPr>
+              <w:t xml:space="preserve">0.5</w:t>
+            </w:r>
+          </w:p>
+        </w:tc>
+        <w:tc>
+          <w:tcPr/>
+          <w:p>
+            <w:pPr>
+              <w:pStyle w:val="Normal"/>
+              <w:jc w:val="left"/>
+              <w:spacing w:line="240" w:lineRule="auto" w:after="0"/>
+            </w:pPr>
+            <w:r>
+              <w:rPr>
+                <w:rFonts w:ascii="Times New Roman" w:hAnsi="Times New Roman" w:cs="Times New Roman" w:eastAsia="Times New Roman"/>
+                <w:sz w:val="20"/>
+                <w:szCs w:val="20"/>
+              </w:rPr>
+              <w:t xml:space="preserve">HR 0.82 (0.59–1.10)</w:t>
+            </w:r>
+          </w:p>
+        </w:tc>
+        <w:tc>
+          <w:tcPr/>
+          <w:p>
+            <w:pPr>
+              <w:pStyle w:val="Normal"/>
+              <w:jc w:val="left"/>
+              <w:spacing w:line="240" w:lineRule="auto" w:after="0"/>
+            </w:pPr>
+            <w:r>
+              <w:rPr>
+                <w:rFonts w:ascii="Times New Roman" w:hAnsi="Times New Roman" w:cs="Times New Roman" w:eastAsia="Times New Roman"/>
+                <w:sz w:val="20"/>
+                <w:szCs w:val="20"/>
+              </w:rPr>
+              <w:t xml:space="preserve">93.9%</w:t>
+            </w:r>
+          </w:p>
+        </w:tc>
+        <w:tc>
+          <w:tcPr/>
+          <w:p>
+            <w:pPr>
+              <w:pStyle w:val="Normal"/>
+              <w:jc w:val="left"/>
+              <w:spacing w:line="240" w:lineRule="auto" w:after="0"/>
+            </w:pPr>
+            <w:r>
+              <w:rPr>
+                <w:rFonts w:ascii="Times New Roman" w:hAnsi="Times New Roman" w:cs="Times New Roman" w:eastAsia="Times New Roman"/>
+                <w:sz w:val="20"/>
+                <w:szCs w:val="20"/>
+              </w:rPr>
+              <w:t xml:space="preserve">79.6%</w:t>
+            </w:r>
+          </w:p>
+        </w:tc>
+        <w:tc>
+          <w:tcPr/>
+          <w:p>
+            <w:pPr>
+              <w:pStyle w:val="Normal"/>
+              <w:jc w:val="left"/>
+              <w:spacing w:line="240" w:lineRule="auto" w:after="0"/>
+            </w:pPr>
+            <w:r>
+              <w:rPr>
+                <w:rFonts w:ascii="Times New Roman" w:hAnsi="Times New Roman" w:cs="Times New Roman" w:eastAsia="Times New Roman"/>
+                <w:sz w:val="20"/>
+                <w:szCs w:val="20"/>
+              </w:rPr>
+              <w:t xml:space="preserve">41.9%</w:t>
+            </w:r>
+          </w:p>
+        </w:tc>
+      </w:tr>
+      <w:tr>
+        <w:tc>
+          <w:tcPr/>
+          <w:p>
+            <w:pPr>
+              <w:pStyle w:val="Normal"/>
+              <w:jc w:val="left"/>
+              <w:spacing w:line="240" w:lineRule="auto" w:after="0"/>
+            </w:pPr>
+            <w:r>
+              <w:rPr>
+                <w:rFonts w:ascii="Times New Roman" w:hAnsi="Times New Roman" w:cs="Times New Roman" w:eastAsia="Times New Roman"/>
+                <w:sz w:val="20"/>
+                <w:szCs w:val="20"/>
+              </w:rPr>
+              <w:t xml:space="preserve">Magnesium (OR)</w:t>
+            </w:r>
+          </w:p>
+        </w:tc>
+        <w:tc>
+          <w:tcPr/>
+          <w:p>
+            <w:pPr>
+              <w:pStyle w:val="Normal"/>
+              <w:jc w:val="left"/>
+              <w:spacing w:line="240" w:lineRule="auto" w:after="0"/>
+            </w:pPr>
+            <w:r>
+              <w:rPr>
+                <w:rFonts w:ascii="Times New Roman" w:hAnsi="Times New Roman" w:cs="Times New Roman" w:eastAsia="Times New Roman"/>
+                <w:sz w:val="20"/>
+                <w:szCs w:val="20"/>
+              </w:rPr>
               <w:t xml:space="preserve">0.7</w:t>
             </w:r>
           </w:p>
@@ -4720,7 +2712,7 @@
                 <w:sz w:val="20"/>
                 <w:szCs w:val="20"/>
               </w:rPr>
-              <w:t xml:space="preserve">0.59 (0.29–0.98)</w:t>
+              <w:t xml:space="preserve">OR 0.59 (0.29–0.98)</w:t>
             </w:r>
           </w:p>
         </w:tc>
@@ -4794,655 +2786,10 @@
                 <w:sz w:val="20"/>
                 <w:szCs w:val="20"/>
               </w:rPr>
-              <w:t xml:space="preserve">1.0 (full weight)</w:t>
+              <w:t xml:space="preserve">Statins (HR)</w:t>
             </w:r>
           </w:p>
         </w:tc>
-        <w:tc>
-          <w:tcPr/>
-          <w:p>
-            <w:pPr>
-              <w:pStyle w:val="Normal"/>
-              <w:jc w:val="left"/>
-              <w:spacing w:line="240" w:lineRule="auto" w:after="0"/>
-            </w:pPr>
-            <w:r>
-              <w:rPr>
-                <w:rFonts w:ascii="Times New Roman" w:hAnsi="Times New Roman" w:cs="Times New Roman" w:eastAsia="Times New Roman"/>
-                <w:sz w:val="20"/>
-                <w:szCs w:val="20"/>
-              </w:rPr>
-              <w:t xml:space="preserve">0.55 (0.32–0.87)</w:t>
-            </w:r>
-          </w:p>
-        </w:tc>
-        <w:tc>
-          <w:tcPr/>
-          <w:p>
-            <w:pPr>
-              <w:pStyle w:val="Normal"/>
-              <w:jc w:val="left"/>
-              <w:spacing w:line="240" w:lineRule="auto" w:after="0"/>
-            </w:pPr>
-            <w:r>
-              <w:rPr>
-                <w:rFonts w:ascii="Times New Roman" w:hAnsi="Times New Roman" w:cs="Times New Roman" w:eastAsia="Times New Roman"/>
-                <w:sz w:val="20"/>
-                <w:szCs w:val="20"/>
-              </w:rPr>
-              <w:t xml:space="preserve">99.6%</w:t>
-            </w:r>
-          </w:p>
-        </w:tc>
-        <w:tc>
-          <w:tcPr/>
-          <w:p>
-            <w:pPr>
-              <w:pStyle w:val="Normal"/>
-              <w:jc w:val="left"/>
-              <w:spacing w:line="240" w:lineRule="auto" w:after="0"/>
-            </w:pPr>
-            <w:r>
-              <w:rPr>
-                <w:rFonts w:ascii="Times New Roman" w:hAnsi="Times New Roman" w:cs="Times New Roman" w:eastAsia="Times New Roman"/>
-                <w:sz w:val="20"/>
-                <w:szCs w:val="20"/>
-              </w:rPr>
-              <w:t xml:space="preserve">98.4%</w:t>
-            </w:r>
-          </w:p>
-        </w:tc>
-        <w:tc>
-          <w:tcPr/>
-          <w:p>
-            <w:pPr>
-              <w:pStyle w:val="Normal"/>
-              <w:jc w:val="left"/>
-              <w:spacing w:line="240" w:lineRule="auto" w:after="0"/>
-            </w:pPr>
-            <w:r>
-              <w:rPr>
-                <w:rFonts w:ascii="Times New Roman" w:hAnsi="Times New Roman" w:cs="Times New Roman" w:eastAsia="Times New Roman"/>
-                <w:sz w:val="20"/>
-                <w:szCs w:val="20"/>
-              </w:rPr>
-              <w:t xml:space="preserve">94.4%</w:t>
-            </w:r>
-          </w:p>
-        </w:tc>
-      </w:tr>
-    </w:tbl>
-    <w:tbl xmlns:a="http://schemas.openxmlformats.org/drawingml/2006/main" xmlns:pic="http://schemas.openxmlformats.org/drawingml/2006/picture">
-      <w:tblPr>
-        <w:tblStyle w:val="Table Grid"/>
-        <w:tblW w:type="auto" w:w="0"/>
-        <w:tblLook w:firstRow="1" w:lastRow="0" w:firstColumn="0" w:lastColumn="0" w:noHBand="0" w:noVBand="0" w:val="0020"/>
-        <w:jc w:val="center"/>
-      </w:tblPr>
-      <w:tblGrid>
-        <w:gridCol w:w="1584"/>
-        <w:gridCol w:w="1584"/>
-        <w:gridCol w:w="1584"/>
-        <w:gridCol w:w="1584"/>
-        <w:gridCol w:w="1584"/>
-      </w:tblGrid>
-      <w:tr>
-        <w:trPr>
-          <w:tblHeader w:val="true"/>
-        </w:trPr>
-        <w:tc>
-          <w:tcPr/>
-          <w:p>
-            <w:pPr>
-              <w:pStyle w:val="Normal"/>
-              <w:jc w:val="left"/>
-              <w:spacing w:line="240" w:lineRule="auto" w:after="0"/>
-            </w:pPr>
-            <m:oMath>
-              <m:r>
-                <m:t>α</m:t>
-              </m:r>
-            </m:oMath>
-          </w:p>
-        </w:tc>
-        <w:tc>
-          <w:tcPr/>
-          <w:p>
-            <w:pPr>
-              <w:pStyle w:val="Normal"/>
-              <w:jc w:val="left"/>
-              <w:spacing w:line="240" w:lineRule="auto" w:after="0"/>
-            </w:pPr>
-            <w:r>
-              <w:rPr>
-                <w:rFonts w:ascii="Times New Roman" w:hAnsi="Times New Roman" w:cs="Times New Roman" w:eastAsia="Times New Roman"/>
-                <w:sz w:val="20"/>
-                <w:szCs w:val="20"/>
-                <w:b/>
-              </w:rPr>
-              <w:t xml:space="preserve">HR (95% CrI)</w:t>
-            </w:r>
-          </w:p>
-        </w:tc>
-        <w:tc>
-          <w:tcPr/>
-          <w:p>
-            <w:pPr>
-              <w:pStyle w:val="Normal"/>
-              <w:jc w:val="left"/>
-              <w:spacing w:line="240" w:lineRule="auto" w:after="0"/>
-            </w:pPr>
-            <w:r>
-              <w:rPr>
-                <w:rFonts w:ascii="Times New Roman" w:hAnsi="Times New Roman" w:cs="Times New Roman" w:eastAsia="Times New Roman"/>
-                <w:sz w:val="20"/>
-                <w:szCs w:val="20"/>
-                <w:b/>
-              </w:rPr>
-              <w:t xml:space="preserve">P(HR &lt; 1)</w:t>
-            </w:r>
-          </w:p>
-        </w:tc>
-        <w:tc>
-          <w:tcPr/>
-          <w:p>
-            <w:pPr>
-              <w:pStyle w:val="Normal"/>
-              <w:jc w:val="left"/>
-              <w:spacing w:line="240" w:lineRule="auto" w:after="0"/>
-            </w:pPr>
-            <w:r>
-              <w:rPr>
-                <w:rFonts w:ascii="Times New Roman" w:hAnsi="Times New Roman" w:cs="Times New Roman" w:eastAsia="Times New Roman"/>
-                <w:sz w:val="20"/>
-                <w:szCs w:val="20"/>
-                <w:b/>
-              </w:rPr>
-              <w:t xml:space="preserve">P(HR &lt; 0.90)</w:t>
-            </w:r>
-          </w:p>
-        </w:tc>
-        <w:tc>
-          <w:tcPr/>
-          <w:p>
-            <w:pPr>
-              <w:pStyle w:val="Normal"/>
-              <w:jc w:val="left"/>
-              <w:spacing w:line="240" w:lineRule="auto" w:after="0"/>
-            </w:pPr>
-            <w:r>
-              <w:rPr>
-                <w:rFonts w:ascii="Times New Roman" w:hAnsi="Times New Roman" w:cs="Times New Roman" w:eastAsia="Times New Roman"/>
-                <w:sz w:val="20"/>
-                <w:szCs w:val="20"/>
-                <w:b/>
-              </w:rPr>
-              <w:t xml:space="preserve">P(HR &lt; 0.80)</w:t>
-            </w:r>
-          </w:p>
-        </w:tc>
-      </w:tr>
-      <w:tr>
-        <w:tc>
-          <w:tcPr/>
-          <w:p>
-            <w:pPr>
-              <w:pStyle w:val="Normal"/>
-              <w:jc w:val="left"/>
-              <w:spacing w:line="240" w:lineRule="auto" w:after="0"/>
-            </w:pPr>
-            <w:r>
-              <w:rPr>
-                <w:rFonts w:ascii="Times New Roman" w:hAnsi="Times New Roman" w:cs="Times New Roman" w:eastAsia="Times New Roman"/>
-                <w:sz w:val="20"/>
-                <w:szCs w:val="20"/>
-              </w:rPr>
-              <w:t xml:space="preserve">0.0 (RCTs only)</w:t>
-            </w:r>
-          </w:p>
-        </w:tc>
-        <w:tc>
-          <w:tcPr/>
-          <w:p>
-            <w:pPr>
-              <w:pStyle w:val="Normal"/>
-              <w:jc w:val="left"/>
-              <w:spacing w:line="240" w:lineRule="auto" w:after="0"/>
-            </w:pPr>
-            <w:r>
-              <w:rPr>
-                <w:rFonts w:ascii="Times New Roman" w:hAnsi="Times New Roman" w:cs="Times New Roman" w:eastAsia="Times New Roman"/>
-                <w:sz w:val="20"/>
-                <w:szCs w:val="20"/>
-              </w:rPr>
-              <w:t xml:space="preserve">0.97 (0.58–1.65)</w:t>
-            </w:r>
-          </w:p>
-        </w:tc>
-        <w:tc>
-          <w:tcPr/>
-          <w:p>
-            <w:pPr>
-              <w:pStyle w:val="Normal"/>
-              <w:jc w:val="left"/>
-              <w:spacing w:line="240" w:lineRule="auto" w:after="0"/>
-            </w:pPr>
-            <w:r>
-              <w:rPr>
-                <w:rFonts w:ascii="Times New Roman" w:hAnsi="Times New Roman" w:cs="Times New Roman" w:eastAsia="Times New Roman"/>
-                <w:sz w:val="20"/>
-                <w:szCs w:val="20"/>
-              </w:rPr>
-              <w:t xml:space="preserve">62.9%</w:t>
-            </w:r>
-          </w:p>
-        </w:tc>
-        <w:tc>
-          <w:tcPr/>
-          <w:p>
-            <w:pPr>
-              <w:pStyle w:val="Normal"/>
-              <w:jc w:val="left"/>
-              <w:spacing w:line="240" w:lineRule="auto" w:after="0"/>
-            </w:pPr>
-            <w:r>
-              <w:rPr>
-                <w:rFonts w:ascii="Times New Roman" w:hAnsi="Times New Roman" w:cs="Times New Roman" w:eastAsia="Times New Roman"/>
-                <w:sz w:val="20"/>
-                <w:szCs w:val="20"/>
-              </w:rPr>
-              <w:t xml:space="preserve">21.2%</w:t>
-            </w:r>
-          </w:p>
-        </w:tc>
-        <w:tc>
-          <w:tcPr/>
-          <w:p>
-            <w:pPr>
-              <w:pStyle w:val="Normal"/>
-              <w:jc w:val="left"/>
-              <w:spacing w:line="240" w:lineRule="auto" w:after="0"/>
-            </w:pPr>
-            <w:r>
-              <w:rPr>
-                <w:rFonts w:ascii="Times New Roman" w:hAnsi="Times New Roman" w:cs="Times New Roman" w:eastAsia="Times New Roman"/>
-                <w:sz w:val="20"/>
-                <w:szCs w:val="20"/>
-              </w:rPr>
-              <w:t xml:space="preserve">8.9%</w:t>
-            </w:r>
-          </w:p>
-        </w:tc>
-      </w:tr>
-      <w:tr>
-        <w:tc>
-          <w:tcPr/>
-          <w:p>
-            <w:pPr>
-              <w:pStyle w:val="Normal"/>
-              <w:jc w:val="left"/>
-              <w:spacing w:line="240" w:lineRule="auto" w:after="0"/>
-            </w:pPr>
-            <w:r>
-              <w:rPr>
-                <w:rFonts w:ascii="Times New Roman" w:hAnsi="Times New Roman" w:cs="Times New Roman" w:eastAsia="Times New Roman"/>
-                <w:sz w:val="20"/>
-                <w:szCs w:val="20"/>
-              </w:rPr>
-              <w:t xml:space="preserve">0.1</w:t>
-            </w:r>
-          </w:p>
-        </w:tc>
-        <w:tc>
-          <w:tcPr/>
-          <w:p>
-            <w:pPr>
-              <w:pStyle w:val="Normal"/>
-              <w:jc w:val="left"/>
-              <w:spacing w:line="240" w:lineRule="auto" w:after="0"/>
-            </w:pPr>
-            <w:r>
-              <w:rPr>
-                <w:rFonts w:ascii="Times New Roman" w:hAnsi="Times New Roman" w:cs="Times New Roman" w:eastAsia="Times New Roman"/>
-                <w:sz w:val="20"/>
-                <w:szCs w:val="20"/>
-              </w:rPr>
-              <w:t xml:space="preserve">0.92 (0.53–1.64)</w:t>
-            </w:r>
-          </w:p>
-        </w:tc>
-        <w:tc>
-          <w:tcPr/>
-          <w:p>
-            <w:pPr>
-              <w:pStyle w:val="Normal"/>
-              <w:jc w:val="left"/>
-              <w:spacing w:line="240" w:lineRule="auto" w:after="0"/>
-            </w:pPr>
-            <w:r>
-              <w:rPr>
-                <w:rFonts w:ascii="Times New Roman" w:hAnsi="Times New Roman" w:cs="Times New Roman" w:eastAsia="Times New Roman"/>
-                <w:sz w:val="20"/>
-                <w:szCs w:val="20"/>
-              </w:rPr>
-              <w:t xml:space="preserve">71.9%</w:t>
-            </w:r>
-          </w:p>
-        </w:tc>
-        <w:tc>
-          <w:tcPr/>
-          <w:p>
-            <w:pPr>
-              <w:pStyle w:val="Normal"/>
-              <w:jc w:val="left"/>
-              <w:spacing w:line="240" w:lineRule="auto" w:after="0"/>
-            </w:pPr>
-            <w:r>
-              <w:rPr>
-                <w:rFonts w:ascii="Times New Roman" w:hAnsi="Times New Roman" w:cs="Times New Roman" w:eastAsia="Times New Roman"/>
-                <w:sz w:val="20"/>
-                <w:szCs w:val="20"/>
-              </w:rPr>
-              <w:t xml:space="preserve">42.7%</w:t>
-            </w:r>
-          </w:p>
-        </w:tc>
-        <w:tc>
-          <w:tcPr/>
-          <w:p>
-            <w:pPr>
-              <w:pStyle w:val="Normal"/>
-              <w:jc w:val="left"/>
-              <w:spacing w:line="240" w:lineRule="auto" w:after="0"/>
-            </w:pPr>
-            <w:r>
-              <w:rPr>
-                <w:rFonts w:ascii="Times New Roman" w:hAnsi="Times New Roman" w:cs="Times New Roman" w:eastAsia="Times New Roman"/>
-                <w:sz w:val="20"/>
-                <w:szCs w:val="20"/>
-              </w:rPr>
-              <w:t xml:space="preserve">19.2%</w:t>
-            </w:r>
-          </w:p>
-        </w:tc>
-      </w:tr>
-      <w:tr>
-        <w:tc>
-          <w:tcPr/>
-          <w:p>
-            <w:pPr>
-              <w:pStyle w:val="Normal"/>
-              <w:jc w:val="left"/>
-              <w:spacing w:line="240" w:lineRule="auto" w:after="0"/>
-            </w:pPr>
-            <w:r>
-              <w:rPr>
-                <w:rFonts w:ascii="Times New Roman" w:hAnsi="Times New Roman" w:cs="Times New Roman" w:eastAsia="Times New Roman"/>
-                <w:sz w:val="20"/>
-                <w:szCs w:val="20"/>
-              </w:rPr>
-              <w:t xml:space="preserve">0.2</w:t>
-            </w:r>
-          </w:p>
-        </w:tc>
-        <w:tc>
-          <w:tcPr/>
-          <w:p>
-            <w:pPr>
-              <w:pStyle w:val="Normal"/>
-              <w:jc w:val="left"/>
-              <w:spacing w:line="240" w:lineRule="auto" w:after="0"/>
-            </w:pPr>
-            <w:r>
-              <w:rPr>
-                <w:rFonts w:ascii="Times New Roman" w:hAnsi="Times New Roman" w:cs="Times New Roman" w:eastAsia="Times New Roman"/>
-                <w:sz w:val="20"/>
-                <w:szCs w:val="20"/>
-              </w:rPr>
-              <w:t xml:space="preserve">0.89 (0.53–1.41)</w:t>
-            </w:r>
-          </w:p>
-        </w:tc>
-        <w:tc>
-          <w:tcPr/>
-          <w:p>
-            <w:pPr>
-              <w:pStyle w:val="Normal"/>
-              <w:jc w:val="left"/>
-              <w:spacing w:line="240" w:lineRule="auto" w:after="0"/>
-            </w:pPr>
-            <w:r>
-              <w:rPr>
-                <w:rFonts w:ascii="Times New Roman" w:hAnsi="Times New Roman" w:cs="Times New Roman" w:eastAsia="Times New Roman"/>
-                <w:sz w:val="20"/>
-                <w:szCs w:val="20"/>
-              </w:rPr>
-              <w:t xml:space="preserve">79.8%</w:t>
-            </w:r>
-          </w:p>
-        </w:tc>
-        <w:tc>
-          <w:tcPr/>
-          <w:p>
-            <w:pPr>
-              <w:pStyle w:val="Normal"/>
-              <w:jc w:val="left"/>
-              <w:spacing w:line="240" w:lineRule="auto" w:after="0"/>
-            </w:pPr>
-            <w:r>
-              <w:rPr>
-                <w:rFonts w:ascii="Times New Roman" w:hAnsi="Times New Roman" w:cs="Times New Roman" w:eastAsia="Times New Roman"/>
-                <w:sz w:val="20"/>
-                <w:szCs w:val="20"/>
-              </w:rPr>
-              <w:t xml:space="preserve">54.7%</w:t>
-            </w:r>
-          </w:p>
-        </w:tc>
-        <w:tc>
-          <w:tcPr/>
-          <w:p>
-            <w:pPr>
-              <w:pStyle w:val="Normal"/>
-              <w:jc w:val="left"/>
-              <w:spacing w:line="240" w:lineRule="auto" w:after="0"/>
-            </w:pPr>
-            <w:r>
-              <w:rPr>
-                <w:rFonts w:ascii="Times New Roman" w:hAnsi="Times New Roman" w:cs="Times New Roman" w:eastAsia="Times New Roman"/>
-                <w:sz w:val="20"/>
-                <w:szCs w:val="20"/>
-              </w:rPr>
-              <w:t xml:space="preserve">24.4%</w:t>
-            </w:r>
-          </w:p>
-        </w:tc>
-      </w:tr>
-      <w:tr>
-        <w:tc>
-          <w:tcPr/>
-          <w:p>
-            <w:pPr>
-              <w:pStyle w:val="Normal"/>
-              <w:jc w:val="left"/>
-              <w:spacing w:line="240" w:lineRule="auto" w:after="0"/>
-            </w:pPr>
-            <w:r>
-              <w:rPr>
-                <w:rFonts w:ascii="Times New Roman" w:hAnsi="Times New Roman" w:cs="Times New Roman" w:eastAsia="Times New Roman"/>
-                <w:sz w:val="20"/>
-                <w:szCs w:val="20"/>
-              </w:rPr>
-              <w:t xml:space="preserve">0.3</w:t>
-            </w:r>
-          </w:p>
-        </w:tc>
-        <w:tc>
-          <w:tcPr/>
-          <w:p>
-            <w:pPr>
-              <w:pStyle w:val="Normal"/>
-              <w:jc w:val="left"/>
-              <w:spacing w:line="240" w:lineRule="auto" w:after="0"/>
-            </w:pPr>
-            <w:r>
-              <w:rPr>
-                <w:rFonts w:ascii="Times New Roman" w:hAnsi="Times New Roman" w:cs="Times New Roman" w:eastAsia="Times New Roman"/>
-                <w:sz w:val="20"/>
-                <w:szCs w:val="20"/>
-              </w:rPr>
-              <w:t xml:space="preserve">0.85 (0.55–1.24)</w:t>
-            </w:r>
-          </w:p>
-        </w:tc>
-        <w:tc>
-          <w:tcPr/>
-          <w:p>
-            <w:pPr>
-              <w:pStyle w:val="Normal"/>
-              <w:jc w:val="left"/>
-              <w:spacing w:line="240" w:lineRule="auto" w:after="0"/>
-            </w:pPr>
-            <w:r>
-              <w:rPr>
-                <w:rFonts w:ascii="Times New Roman" w:hAnsi="Times New Roman" w:cs="Times New Roman" w:eastAsia="Times New Roman"/>
-                <w:sz w:val="20"/>
-                <w:szCs w:val="20"/>
-              </w:rPr>
-              <w:t xml:space="preserve">86.5%</w:t>
-            </w:r>
-          </w:p>
-        </w:tc>
-        <w:tc>
-          <w:tcPr/>
-          <w:p>
-            <w:pPr>
-              <w:pStyle w:val="Normal"/>
-              <w:jc w:val="left"/>
-              <w:spacing w:line="240" w:lineRule="auto" w:after="0"/>
-            </w:pPr>
-            <w:r>
-              <w:rPr>
-                <w:rFonts w:ascii="Times New Roman" w:hAnsi="Times New Roman" w:cs="Times New Roman" w:eastAsia="Times New Roman"/>
-                <w:sz w:val="20"/>
-                <w:szCs w:val="20"/>
-              </w:rPr>
-              <w:t xml:space="preserve">66.0%</w:t>
-            </w:r>
-          </w:p>
-        </w:tc>
-        <w:tc>
-          <w:tcPr/>
-          <w:p>
-            <w:pPr>
-              <w:pStyle w:val="Normal"/>
-              <w:jc w:val="left"/>
-              <w:spacing w:line="240" w:lineRule="auto" w:after="0"/>
-            </w:pPr>
-            <w:r>
-              <w:rPr>
-                <w:rFonts w:ascii="Times New Roman" w:hAnsi="Times New Roman" w:cs="Times New Roman" w:eastAsia="Times New Roman"/>
-                <w:sz w:val="20"/>
-                <w:szCs w:val="20"/>
-              </w:rPr>
-              <w:t xml:space="preserve">31.1%</w:t>
-            </w:r>
-          </w:p>
-        </w:tc>
-      </w:tr>
-      <w:tr>
-        <w:tc>
-          <w:tcPr/>
-          <w:p>
-            <w:pPr>
-              <w:pStyle w:val="Normal"/>
-              <w:jc w:val="left"/>
-              <w:spacing w:line="240" w:lineRule="auto" w:after="0"/>
-            </w:pPr>
-            <w:r>
-              <w:rPr>
-                <w:rFonts w:ascii="Times New Roman" w:hAnsi="Times New Roman" w:cs="Times New Roman" w:eastAsia="Times New Roman"/>
-                <w:sz w:val="20"/>
-                <w:szCs w:val="20"/>
-              </w:rPr>
-              <w:t xml:space="preserve">0.5</w:t>
-            </w:r>
-          </w:p>
-        </w:tc>
-        <w:tc>
-          <w:tcPr/>
-          <w:p>
-            <w:pPr>
-              <w:pStyle w:val="Normal"/>
-              <w:jc w:val="left"/>
-              <w:spacing w:line="240" w:lineRule="auto" w:after="0"/>
-            </w:pPr>
-            <w:r>
-              <w:rPr>
-                <w:rFonts w:ascii="Times New Roman" w:hAnsi="Times New Roman" w:cs="Times New Roman" w:eastAsia="Times New Roman"/>
-                <w:sz w:val="20"/>
-                <w:szCs w:val="20"/>
-              </w:rPr>
-              <w:t xml:space="preserve">0.82 (0.59–1.10)</w:t>
-            </w:r>
-          </w:p>
-        </w:tc>
-        <w:tc>
-          <w:tcPr/>
-          <w:p>
-            <w:pPr>
-              <w:pStyle w:val="Normal"/>
-              <w:jc w:val="left"/>
-              <w:spacing w:line="240" w:lineRule="auto" w:after="0"/>
-            </w:pPr>
-            <w:r>
-              <w:rPr>
-                <w:rFonts w:ascii="Times New Roman" w:hAnsi="Times New Roman" w:cs="Times New Roman" w:eastAsia="Times New Roman"/>
-                <w:sz w:val="20"/>
-                <w:szCs w:val="20"/>
-              </w:rPr>
-              <w:t xml:space="preserve">93.9%</w:t>
-            </w:r>
-          </w:p>
-        </w:tc>
-        <w:tc>
-          <w:tcPr/>
-          <w:p>
-            <w:pPr>
-              <w:pStyle w:val="Normal"/>
-              <w:jc w:val="left"/>
-              <w:spacing w:line="240" w:lineRule="auto" w:after="0"/>
-            </w:pPr>
-            <w:r>
-              <w:rPr>
-                <w:rFonts w:ascii="Times New Roman" w:hAnsi="Times New Roman" w:cs="Times New Roman" w:eastAsia="Times New Roman"/>
-                <w:sz w:val="20"/>
-                <w:szCs w:val="20"/>
-              </w:rPr>
-              <w:t xml:space="preserve">79.6%</w:t>
-            </w:r>
-          </w:p>
-        </w:tc>
-        <w:tc>
-          <w:tcPr/>
-          <w:p>
-            <w:pPr>
-              <w:pStyle w:val="Normal"/>
-              <w:jc w:val="left"/>
-              <w:spacing w:line="240" w:lineRule="auto" w:after="0"/>
-            </w:pPr>
-            <w:r>
-              <w:rPr>
-                <w:rFonts w:ascii="Times New Roman" w:hAnsi="Times New Roman" w:cs="Times New Roman" w:eastAsia="Times New Roman"/>
-                <w:sz w:val="20"/>
-                <w:szCs w:val="20"/>
-              </w:rPr>
-              <w:t xml:space="preserve">41.9%</w:t>
-            </w:r>
-          </w:p>
-        </w:tc>
-      </w:tr>
-      <w:tr>
         <w:tc>
           <w:tcPr/>
           <w:p>
@@ -5475,7 +2822,7 @@
                 <w:sz w:val="20"/>
                 <w:szCs w:val="20"/>
               </w:rPr>
-              <w:t xml:space="preserve">0.80 (0.62–1.00)</w:t>
+              <w:t xml:space="preserve">HR 0.80 (0.62–1.00)</w:t>
             </w:r>
           </w:p>
         </w:tc>
@@ -5549,6 +2896,24 @@
                 <w:sz w:val="20"/>
                 <w:szCs w:val="20"/>
               </w:rPr>
+              <w:t xml:space="preserve">Magnesium (OR)</w:t>
+            </w:r>
+          </w:p>
+        </w:tc>
+        <w:tc>
+          <w:tcPr/>
+          <w:p>
+            <w:pPr>
+              <w:pStyle w:val="Normal"/>
+              <w:jc w:val="left"/>
+              <w:spacing w:line="240" w:lineRule="auto" w:after="0"/>
+            </w:pPr>
+            <w:r>
+              <w:rPr>
+                <w:rFonts w:ascii="Times New Roman" w:hAnsi="Times New Roman" w:cs="Times New Roman" w:eastAsia="Times New Roman"/>
+                <w:sz w:val="20"/>
+                <w:szCs w:val="20"/>
+              </w:rPr>
               <w:t xml:space="preserve">1.0 (full weight)</w:t>
             </w:r>
           </w:p>
@@ -5567,7 +2932,117 @@
                 <w:sz w:val="20"/>
                 <w:szCs w:val="20"/>
               </w:rPr>
-              <w:t xml:space="preserve">0.78 (0.64–0.93)</w:t>
+              <w:t xml:space="preserve">OR 0.55 (0.32–0.87)</w:t>
+            </w:r>
+          </w:p>
+        </w:tc>
+        <w:tc>
+          <w:tcPr/>
+          <w:p>
+            <w:pPr>
+              <w:pStyle w:val="Normal"/>
+              <w:jc w:val="left"/>
+              <w:spacing w:line="240" w:lineRule="auto" w:after="0"/>
+            </w:pPr>
+            <w:r>
+              <w:rPr>
+                <w:rFonts w:ascii="Times New Roman" w:hAnsi="Times New Roman" w:cs="Times New Roman" w:eastAsia="Times New Roman"/>
+                <w:sz w:val="20"/>
+                <w:szCs w:val="20"/>
+              </w:rPr>
+              <w:t xml:space="preserve">99.6%</w:t>
+            </w:r>
+          </w:p>
+        </w:tc>
+        <w:tc>
+          <w:tcPr/>
+          <w:p>
+            <w:pPr>
+              <w:pStyle w:val="Normal"/>
+              <w:jc w:val="left"/>
+              <w:spacing w:line="240" w:lineRule="auto" w:after="0"/>
+            </w:pPr>
+            <w:r>
+              <w:rPr>
+                <w:rFonts w:ascii="Times New Roman" w:hAnsi="Times New Roman" w:cs="Times New Roman" w:eastAsia="Times New Roman"/>
+                <w:sz w:val="20"/>
+                <w:szCs w:val="20"/>
+              </w:rPr>
+              <w:t xml:space="preserve">98.4%</w:t>
+            </w:r>
+          </w:p>
+        </w:tc>
+        <w:tc>
+          <w:tcPr/>
+          <w:p>
+            <w:pPr>
+              <w:pStyle w:val="Normal"/>
+              <w:jc w:val="left"/>
+              <w:spacing w:line="240" w:lineRule="auto" w:after="0"/>
+            </w:pPr>
+            <w:r>
+              <w:rPr>
+                <w:rFonts w:ascii="Times New Roman" w:hAnsi="Times New Roman" w:cs="Times New Roman" w:eastAsia="Times New Roman"/>
+                <w:sz w:val="20"/>
+                <w:szCs w:val="20"/>
+              </w:rPr>
+              <w:t xml:space="preserve">94.4%</w:t>
+            </w:r>
+          </w:p>
+        </w:tc>
+      </w:tr>
+      <w:tr>
+        <w:tc>
+          <w:tcPr/>
+          <w:p>
+            <w:pPr>
+              <w:pStyle w:val="Normal"/>
+              <w:jc w:val="left"/>
+              <w:spacing w:line="240" w:lineRule="auto" w:after="0"/>
+            </w:pPr>
+            <w:r>
+              <w:rPr>
+                <w:rFonts w:ascii="Times New Roman" w:hAnsi="Times New Roman" w:cs="Times New Roman" w:eastAsia="Times New Roman"/>
+                <w:sz w:val="20"/>
+                <w:szCs w:val="20"/>
+              </w:rPr>
+              <w:t xml:space="preserve">Statins (HR)</w:t>
+            </w:r>
+          </w:p>
+        </w:tc>
+        <w:tc>
+          <w:tcPr/>
+          <w:p>
+            <w:pPr>
+              <w:pStyle w:val="Normal"/>
+              <w:jc w:val="left"/>
+              <w:spacing w:line="240" w:lineRule="auto" w:after="0"/>
+            </w:pPr>
+            <w:r>
+              <w:rPr>
+                <w:rFonts w:ascii="Times New Roman" w:hAnsi="Times New Roman" w:cs="Times New Roman" w:eastAsia="Times New Roman"/>
+                <w:sz w:val="20"/>
+                <w:szCs w:val="20"/>
+              </w:rPr>
+              <w:t xml:space="preserve">1.0 (full weight)</w:t>
+            </w:r>
+          </w:p>
+        </w:tc>
+        <w:tc>
+          <w:tcPr/>
+          <w:p>
+            <w:pPr>
+              <w:pStyle w:val="Normal"/>
+              <w:jc w:val="left"/>
+              <w:spacing w:line="240" w:lineRule="auto" w:after="0"/>
+            </w:pPr>
+            <w:r>
+              <w:rPr>
+                <w:rFonts w:ascii="Times New Roman" w:hAnsi="Times New Roman" w:cs="Times New Roman" w:eastAsia="Times New Roman"/>
+                <w:sz w:val="20"/>
+                <w:szCs w:val="20"/>
+              </w:rPr>
+              <w:t xml:space="preserve">HR 0.78 (0.64–0.93)</w:t>
             </w:r>
           </w:p>
         </w:tc>

</xml_diff>